<commit_message>
🚀 Uploading all files
</commit_message>
<xml_diff>
--- a/Resume-Prashant-Singh-Chauhan.docx
+++ b/Resume-Prashant-Singh-Chauhan.docx
@@ -16,18 +16,7 @@
           <w:sz w:val="36"/>
           <w:szCs w:val="36"/>
         </w:rPr>
-        <w:t xml:space="preserve">PRASHANT </w:t>
-      </w:r>
-      <w:r>
-        <w:rPr>
-          <w:rFonts w:ascii="Calibri" w:eastAsia="Calibri" w:hAnsi="Calibri" w:cs="Calibri"/>
-          <w:b/>
-          <w:bCs/>
-          <w:color w:val="1F3864"/>
-          <w:sz w:val="36"/>
-          <w:szCs w:val="36"/>
-        </w:rPr>
-        <w:t>SINGH CHAUHAN</w:t>
+        <w:t>PRASHANT SINGH CHAUHAN</w:t>
       </w:r>
     </w:p>
     <w:p>
@@ -48,61 +37,7 @@
           <w:sz w:val="19"/>
           <w:szCs w:val="19"/>
         </w:rPr>
-        <w:t>M-4, New Police Line, Kingsway Ca</w:t>
-      </w:r>
-      <w:r>
-        <w:rPr>
-          <w:rFonts w:asciiTheme="minorHAnsi" w:eastAsia="Calibri" w:hAnsiTheme="minorHAnsi" w:cstheme="minorHAnsi"/>
-          <w:color w:val="222222"/>
-          <w:sz w:val="19"/>
-          <w:szCs w:val="19"/>
-        </w:rPr>
-        <w:t>m</w:t>
-      </w:r>
-      <w:r>
-        <w:rPr>
-          <w:rFonts w:asciiTheme="minorHAnsi" w:eastAsia="Calibri" w:hAnsiTheme="minorHAnsi" w:cstheme="minorHAnsi"/>
-          <w:color w:val="222222"/>
-          <w:sz w:val="19"/>
-          <w:szCs w:val="19"/>
-        </w:rPr>
-        <w:t>p, Delhi 110009</w:t>
-      </w:r>
-      <w:r>
-        <w:rPr>
-          <w:rFonts w:asciiTheme="minorHAnsi" w:eastAsia="Calibri" w:hAnsiTheme="minorHAnsi" w:cstheme="minorHAnsi"/>
-          <w:color w:val="222222"/>
-          <w:sz w:val="19"/>
-          <w:szCs w:val="19"/>
-        </w:rPr>
-        <w:t xml:space="preserve"> | +</w:t>
-      </w:r>
-      <w:r>
-        <w:rPr>
-          <w:rFonts w:asciiTheme="minorHAnsi" w:eastAsia="Calibri" w:hAnsiTheme="minorHAnsi" w:cstheme="minorHAnsi"/>
-          <w:color w:val="222222"/>
-          <w:sz w:val="19"/>
-          <w:szCs w:val="19"/>
-        </w:rPr>
-        <w:t>91-</w:t>
-      </w:r>
-      <w:r>
-        <w:rPr>
-          <w:rFonts w:asciiTheme="minorHAnsi" w:eastAsia="Calibri" w:hAnsiTheme="minorHAnsi" w:cstheme="minorHAnsi"/>
-          <w:color w:val="222222"/>
-          <w:sz w:val="19"/>
-          <w:szCs w:val="19"/>
-        </w:rPr>
-        <w:t>9999577620 |</w:t>
-      </w:r>
-      <w:r>
-        <w:rPr>
-          <w:rFonts w:asciiTheme="minorHAnsi" w:eastAsia="Calibri" w:hAnsiTheme="minorHAnsi" w:cstheme="minorHAnsi"/>
-          <w:color w:val="222222"/>
-          <w:sz w:val="19"/>
-          <w:szCs w:val="19"/>
-        </w:rPr>
-        <w:t xml:space="preserve">  </w:t>
+        <w:t xml:space="preserve">M-4, New Police Line, Kingsway Camp, Delhi 110009 | +91-9999577620 |  </w:t>
       </w:r>
       <w:hyperlink r:id="rId5" w:history="1">
         <w:r>
@@ -122,16 +57,7 @@
           <w:sz w:val="19"/>
           <w:szCs w:val="19"/>
         </w:rPr>
-        <w:t xml:space="preserve">  |  </w:t>
-      </w:r>
-      <w:r>
-        <w:rPr>
-          <w:rFonts w:asciiTheme="minorHAnsi" w:eastAsia="Calibri" w:hAnsiTheme="minorHAnsi" w:cstheme="minorHAnsi"/>
-          <w:color w:val="222222"/>
-          <w:sz w:val="19"/>
-          <w:szCs w:val="19"/>
-        </w:rPr>
-        <w:t>linkedin.com/in/prashant21292</w:t>
+        <w:t xml:space="preserve">  |  linkedin.com/in/prashant21292</w:t>
       </w:r>
     </w:p>
     <w:p>
@@ -162,37 +88,92 @@
       <w:pPr>
         <w:spacing w:after="80" w:line="276" w:lineRule="auto"/>
         <w:rPr>
-          <w:rFonts w:asciiTheme="minorHAnsi" w:hAnsiTheme="minorHAnsi" w:cstheme="minorHAnsi"/>
-          <w:sz w:val="19"/>
-          <w:szCs w:val="19"/>
-        </w:rPr>
-      </w:pPr>
-      <w:r>
-        <w:rPr>
-          <w:rFonts w:asciiTheme="minorHAnsi" w:eastAsia="Calibri" w:hAnsiTheme="minorHAnsi" w:cstheme="minorHAnsi"/>
-          <w:color w:val="222222"/>
-          <w:sz w:val="19"/>
-          <w:szCs w:val="19"/>
-        </w:rPr>
-        <w:t xml:space="preserve">Full Stack Web Developer with 6+ years building and scaling production web apps for global clients across SaaS, e-commerce, and CRM. Shipped REST APIs serving [10k+] users, cut deployment time [70%] with Docker + CI/CD, and reduced production bugs [45%] through automated testing. Skilled across the MERN stack (MongoDB, Express.js, React, Node.js) plus </w:t>
-      </w:r>
-      <w:r>
-        <w:rPr>
-          <w:rFonts w:asciiTheme="minorHAnsi" w:eastAsia="Calibri" w:hAnsiTheme="minorHAnsi" w:cstheme="minorHAnsi"/>
-          <w:color w:val="222222"/>
-          <w:sz w:val="19"/>
-          <w:szCs w:val="19"/>
-        </w:rPr>
-        <w:t>PHP</w:t>
-      </w:r>
-      <w:r>
-        <w:rPr>
-          <w:rFonts w:asciiTheme="minorHAnsi" w:eastAsia="Calibri" w:hAnsiTheme="minorHAnsi" w:cstheme="minorHAnsi"/>
-          <w:color w:val="222222"/>
-          <w:sz w:val="19"/>
-          <w:szCs w:val="19"/>
-        </w:rPr>
-        <w:t>, and core Laravel. Strong on web security, query optimization, and clean Git workflows.</w:t>
+          <w:rFonts w:asciiTheme="minorHAnsi" w:eastAsia="Calibri" w:hAnsiTheme="minorHAnsi" w:cstheme="minorHAnsi"/>
+          <w:color w:val="222222"/>
+          <w:sz w:val="19"/>
+          <w:szCs w:val="19"/>
+        </w:rPr>
+      </w:pPr>
+      <w:r>
+        <w:rPr>
+          <w:rFonts w:asciiTheme="minorHAnsi" w:eastAsia="Calibri" w:hAnsiTheme="minorHAnsi" w:cstheme="minorHAnsi"/>
+          <w:color w:val="222222"/>
+          <w:sz w:val="19"/>
+          <w:szCs w:val="19"/>
+        </w:rPr>
+        <w:t>Full Stack Web Developer with 6+ years building and scaling production web apps for global clients across SaaS, e-commerce, and CRM</w:t>
+      </w:r>
+      <w:r>
+        <w:rPr>
+          <w:rFonts w:asciiTheme="minorHAnsi" w:eastAsia="Calibri" w:hAnsiTheme="minorHAnsi" w:cstheme="minorHAnsi"/>
+          <w:color w:val="222222"/>
+          <w:sz w:val="19"/>
+          <w:szCs w:val="19"/>
+        </w:rPr>
+        <w:t>, ERPs</w:t>
+      </w:r>
+      <w:r>
+        <w:rPr>
+          <w:rFonts w:asciiTheme="minorHAnsi" w:eastAsia="Calibri" w:hAnsiTheme="minorHAnsi" w:cstheme="minorHAnsi"/>
+          <w:color w:val="222222"/>
+          <w:sz w:val="19"/>
+          <w:szCs w:val="19"/>
+        </w:rPr>
+        <w:t>. Shipped REST APIs serving [10k+] users, cut deployment time [70%] with Docker + CI/CD, and reduced production bugs [45%] through automated testing. Skilled across</w:t>
+      </w:r>
+      <w:r>
+        <w:rPr>
+          <w:rFonts w:asciiTheme="minorHAnsi" w:eastAsia="Calibri" w:hAnsiTheme="minorHAnsi" w:cstheme="minorHAnsi"/>
+          <w:color w:val="222222"/>
+          <w:sz w:val="19"/>
+          <w:szCs w:val="19"/>
+        </w:rPr>
+        <w:t xml:space="preserve"> </w:t>
+      </w:r>
+      <w:r>
+        <w:rPr>
+          <w:rFonts w:asciiTheme="minorHAnsi" w:eastAsia="Calibri" w:hAnsiTheme="minorHAnsi" w:cstheme="minorHAnsi"/>
+          <w:color w:val="222222"/>
+          <w:sz w:val="19"/>
+          <w:szCs w:val="19"/>
+        </w:rPr>
+        <w:t>Core PHP with Laravel</w:t>
+      </w:r>
+      <w:r>
+        <w:rPr>
+          <w:rFonts w:asciiTheme="minorHAnsi" w:eastAsia="Calibri" w:hAnsiTheme="minorHAnsi" w:cstheme="minorHAnsi"/>
+          <w:color w:val="222222"/>
+          <w:sz w:val="19"/>
+          <w:szCs w:val="19"/>
+        </w:rPr>
+        <w:t xml:space="preserve"> and</w:t>
+      </w:r>
+      <w:r>
+        <w:rPr>
+          <w:rFonts w:asciiTheme="minorHAnsi" w:eastAsia="Calibri" w:hAnsiTheme="minorHAnsi" w:cstheme="minorHAnsi"/>
+          <w:color w:val="222222"/>
+          <w:sz w:val="19"/>
+          <w:szCs w:val="19"/>
+        </w:rPr>
+        <w:t xml:space="preserve"> the MERN stack (MongoDB, Express.js, React, Node.js) plus </w:t>
+      </w:r>
+      <w:r>
+        <w:rPr>
+          <w:rFonts w:asciiTheme="minorHAnsi" w:eastAsia="Calibri" w:hAnsiTheme="minorHAnsi" w:cstheme="minorHAnsi"/>
+          <w:color w:val="222222"/>
+          <w:sz w:val="19"/>
+          <w:szCs w:val="19"/>
+        </w:rPr>
+        <w:t>Next.js</w:t>
+      </w:r>
+      <w:r>
+        <w:rPr>
+          <w:rFonts w:asciiTheme="minorHAnsi" w:eastAsia="Calibri" w:hAnsiTheme="minorHAnsi" w:cstheme="minorHAnsi"/>
+          <w:color w:val="222222"/>
+          <w:sz w:val="19"/>
+          <w:szCs w:val="19"/>
+        </w:rPr>
+        <w:t>, and. Strong on web security, query optimization, and clean Git workflows.</w:t>
       </w:r>
     </w:p>
     <w:p>
@@ -276,43 +257,7 @@
           <w:sz w:val="19"/>
           <w:szCs w:val="19"/>
         </w:rPr>
-        <w:t xml:space="preserve">Laravel, React, </w:t>
-      </w:r>
-      <w:r>
-        <w:rPr>
-          <w:rFonts w:asciiTheme="minorHAnsi" w:eastAsia="Calibri" w:hAnsiTheme="minorHAnsi" w:cstheme="minorHAnsi"/>
-          <w:color w:val="222222"/>
-          <w:sz w:val="19"/>
-          <w:szCs w:val="19"/>
-        </w:rPr>
-        <w:t xml:space="preserve">Next.js, </w:t>
-      </w:r>
-      <w:r>
-        <w:rPr>
-          <w:rFonts w:asciiTheme="minorHAnsi" w:eastAsia="Calibri" w:hAnsiTheme="minorHAnsi" w:cstheme="minorHAnsi"/>
-          <w:color w:val="222222"/>
-          <w:sz w:val="19"/>
-          <w:szCs w:val="19"/>
-        </w:rPr>
-        <w:t>Node.js, Express.js, Mongoose, jQuery, Bootstrap, Tailwind CSS</w:t>
-      </w:r>
-      <w:r>
-        <w:rPr>
-          <w:rFonts w:asciiTheme="minorHAnsi" w:eastAsia="Calibri" w:hAnsiTheme="minorHAnsi" w:cstheme="minorHAnsi"/>
-          <w:color w:val="222222"/>
-          <w:sz w:val="19"/>
-          <w:szCs w:val="19"/>
-        </w:rPr>
-        <w:t>, Bootstrap</w:t>
-      </w:r>
-      <w:r>
-        <w:rPr>
-          <w:rFonts w:asciiTheme="minorHAnsi" w:eastAsia="Calibri" w:hAnsiTheme="minorHAnsi" w:cstheme="minorHAnsi"/>
-          <w:color w:val="222222"/>
-          <w:sz w:val="19"/>
-          <w:szCs w:val="19"/>
-        </w:rPr>
-        <w:t xml:space="preserve"> 5</w:t>
+        <w:t>Laravel, React, Next.js, Node.js, Express.js, Mongoose, jQuery, Bootstrap, Tailwind CSS, Bootstrap 5</w:t>
       </w:r>
     </w:p>
     <w:p>
@@ -342,25 +287,7 @@
           <w:sz w:val="19"/>
           <w:szCs w:val="19"/>
         </w:rPr>
-        <w:t>MongoDB, Express.js, React, Node.js (</w:t>
-      </w:r>
-      <w:r>
-        <w:rPr>
-          <w:rFonts w:asciiTheme="minorHAnsi" w:eastAsia="Calibri" w:hAnsiTheme="minorHAnsi" w:cstheme="minorHAnsi"/>
-          <w:color w:val="222222"/>
-          <w:sz w:val="19"/>
-          <w:szCs w:val="19"/>
-        </w:rPr>
-        <w:t>F</w:t>
-      </w:r>
-      <w:r>
-        <w:rPr>
-          <w:rFonts w:asciiTheme="minorHAnsi" w:eastAsia="Calibri" w:hAnsiTheme="minorHAnsi" w:cstheme="minorHAnsi"/>
-          <w:color w:val="222222"/>
-          <w:sz w:val="19"/>
-          <w:szCs w:val="19"/>
-        </w:rPr>
-        <w:t>ull-stack JS apps, RESTful APIs, JWT auth, Mongoose ODM)</w:t>
+        <w:t>MongoDB, Express.js, React, Node.js (Full-stack JS apps, RESTful APIs, JWT auth, Mongoose ODM)</w:t>
       </w:r>
     </w:p>
     <w:p>
@@ -420,61 +347,7 @@
           <w:sz w:val="19"/>
           <w:szCs w:val="19"/>
         </w:rPr>
-        <w:t xml:space="preserve">Docker, CI/CD (GitLab CI / GitHub Actions), Git, AWS (EC2, S3, </w:t>
-      </w:r>
-      <w:r>
-        <w:rPr>
-          <w:rFonts w:asciiTheme="minorHAnsi" w:eastAsia="Calibri" w:hAnsiTheme="minorHAnsi" w:cstheme="minorHAnsi"/>
-          <w:color w:val="222222"/>
-          <w:sz w:val="19"/>
-          <w:szCs w:val="19"/>
-        </w:rPr>
-        <w:t>Light</w:t>
-      </w:r>
-      <w:r>
-        <w:rPr>
-          <w:rFonts w:asciiTheme="minorHAnsi" w:eastAsia="Calibri" w:hAnsiTheme="minorHAnsi" w:cstheme="minorHAnsi"/>
-          <w:color w:val="222222"/>
-          <w:sz w:val="19"/>
-          <w:szCs w:val="19"/>
-        </w:rPr>
-        <w:t>S</w:t>
-      </w:r>
-      <w:r>
-        <w:rPr>
-          <w:rFonts w:asciiTheme="minorHAnsi" w:eastAsia="Calibri" w:hAnsiTheme="minorHAnsi" w:cstheme="minorHAnsi"/>
-          <w:color w:val="222222"/>
-          <w:sz w:val="19"/>
-          <w:szCs w:val="19"/>
-        </w:rPr>
-        <w:t>ail</w:t>
-      </w:r>
-      <w:r>
-        <w:rPr>
-          <w:rFonts w:asciiTheme="minorHAnsi" w:eastAsia="Calibri" w:hAnsiTheme="minorHAnsi" w:cstheme="minorHAnsi"/>
-          <w:color w:val="222222"/>
-          <w:sz w:val="19"/>
-          <w:szCs w:val="19"/>
-        </w:rPr>
-        <w:t>), Linux</w:t>
-      </w:r>
-      <w:r>
-        <w:rPr>
-          <w:rFonts w:asciiTheme="minorHAnsi" w:eastAsia="Calibri" w:hAnsiTheme="minorHAnsi" w:cstheme="minorHAnsi"/>
-          <w:color w:val="222222"/>
-          <w:sz w:val="19"/>
-          <w:szCs w:val="19"/>
-        </w:rPr>
-        <w:t xml:space="preserve"> / Ubuntu, </w:t>
-      </w:r>
-      <w:r>
-        <w:rPr>
-          <w:rFonts w:asciiTheme="minorHAnsi" w:eastAsia="Calibri" w:hAnsiTheme="minorHAnsi" w:cstheme="minorHAnsi"/>
-          <w:color w:val="222222"/>
-          <w:sz w:val="19"/>
-          <w:szCs w:val="19"/>
-        </w:rPr>
-        <w:t>cPanel</w:t>
+        <w:t>Docker, CI/CD (GitLab CI / GitHub Actions), Git, AWS (EC2, S3, LightSail), Linux / Ubuntu, cPanel</w:t>
       </w:r>
     </w:p>
     <w:p>
@@ -504,34 +377,7 @@
           <w:sz w:val="19"/>
           <w:szCs w:val="19"/>
         </w:rPr>
-        <w:t>PHP</w:t>
-      </w:r>
-      <w:r>
-        <w:rPr>
-          <w:rFonts w:asciiTheme="minorHAnsi" w:eastAsia="Calibri" w:hAnsiTheme="minorHAnsi" w:cstheme="minorHAnsi"/>
-          <w:color w:val="222222"/>
-          <w:sz w:val="19"/>
-          <w:szCs w:val="19"/>
-        </w:rPr>
-        <w:t xml:space="preserve"> </w:t>
-      </w:r>
-      <w:r>
-        <w:rPr>
-          <w:rFonts w:asciiTheme="minorHAnsi" w:eastAsia="Calibri" w:hAnsiTheme="minorHAnsi" w:cstheme="minorHAnsi"/>
-          <w:color w:val="222222"/>
-          <w:sz w:val="19"/>
-          <w:szCs w:val="19"/>
-        </w:rPr>
-        <w:t>Unit, Jest, REST API design, JWT/OAuth, CSRF/XSS protection, Web Scraping</w:t>
-      </w:r>
-      <w:r>
-        <w:rPr>
-          <w:rFonts w:asciiTheme="minorHAnsi" w:eastAsia="Calibri" w:hAnsiTheme="minorHAnsi" w:cstheme="minorHAnsi"/>
-          <w:color w:val="222222"/>
-          <w:sz w:val="19"/>
-          <w:szCs w:val="19"/>
-        </w:rPr>
-        <w:t xml:space="preserve"> Tools</w:t>
+        <w:t>PHP Unit, Jest, REST API design, JWT/OAuth, CSRF/XSS protection, Web Scraping Tools</w:t>
       </w:r>
     </w:p>
     <w:p>
@@ -562,50 +408,15 @@
           <w:sz w:val="19"/>
           <w:szCs w:val="19"/>
         </w:rPr>
-        <w:t>WordPress</w:t>
-      </w:r>
-      <w:r>
-        <w:rPr>
-          <w:rFonts w:asciiTheme="minorHAnsi" w:eastAsia="Calibri" w:hAnsiTheme="minorHAnsi" w:cstheme="minorHAnsi"/>
-          <w:color w:val="222222"/>
-          <w:sz w:val="19"/>
-          <w:szCs w:val="19"/>
-        </w:rPr>
-        <w:t>, Open</w:t>
-      </w:r>
-      <w:r>
-        <w:rPr>
-          <w:rFonts w:asciiTheme="minorHAnsi" w:eastAsia="Calibri" w:hAnsiTheme="minorHAnsi" w:cstheme="minorHAnsi"/>
-          <w:color w:val="222222"/>
-          <w:sz w:val="19"/>
-          <w:szCs w:val="19"/>
-        </w:rPr>
-        <w:t>C</w:t>
-      </w:r>
-      <w:r>
-        <w:rPr>
-          <w:rFonts w:asciiTheme="minorHAnsi" w:eastAsia="Calibri" w:hAnsiTheme="minorHAnsi" w:cstheme="minorHAnsi"/>
-          <w:color w:val="222222"/>
-          <w:sz w:val="19"/>
-          <w:szCs w:val="19"/>
-        </w:rPr>
-        <w:t>art, Magento</w:t>
-      </w:r>
-      <w:r>
-        <w:rPr>
-          <w:rFonts w:asciiTheme="minorHAnsi" w:eastAsia="Calibri" w:hAnsiTheme="minorHAnsi" w:cstheme="minorHAnsi"/>
-          <w:color w:val="222222"/>
-          <w:sz w:val="19"/>
-          <w:szCs w:val="19"/>
-        </w:rPr>
-        <w:t>, Shopify</w:t>
+        <w:t>WordPress, OpenCart, Magento, Shopify</w:t>
       </w:r>
     </w:p>
     <w:p>
       <w:pPr>
         <w:spacing w:after="80" w:line="276" w:lineRule="auto"/>
         <w:rPr>
-          <w:rFonts w:asciiTheme="minorHAnsi" w:hAnsiTheme="minorHAnsi" w:cstheme="minorHAnsi"/>
+          <w:rFonts w:asciiTheme="minorHAnsi" w:eastAsia="Calibri" w:hAnsiTheme="minorHAnsi" w:cstheme="minorHAnsi"/>
+          <w:color w:val="222222"/>
           <w:sz w:val="19"/>
           <w:szCs w:val="19"/>
         </w:rPr>
@@ -628,110 +439,7 @@
           <w:sz w:val="19"/>
           <w:szCs w:val="19"/>
         </w:rPr>
-        <w:t xml:space="preserve"> </w:t>
-      </w:r>
-      <w:r>
-        <w:rPr>
-          <w:rFonts w:asciiTheme="minorHAnsi" w:eastAsia="Calibri" w:hAnsiTheme="minorHAnsi" w:cstheme="minorHAnsi"/>
-          <w:color w:val="222222"/>
-          <w:sz w:val="19"/>
-          <w:szCs w:val="19"/>
-        </w:rPr>
-        <w:t>WhatsApp Business API, Stripe,</w:t>
-      </w:r>
-      <w:r>
-        <w:rPr>
-          <w:rFonts w:asciiTheme="minorHAnsi" w:eastAsia="Calibri" w:hAnsiTheme="minorHAnsi" w:cstheme="minorHAnsi"/>
-          <w:color w:val="222222"/>
-          <w:sz w:val="19"/>
-          <w:szCs w:val="19"/>
-        </w:rPr>
-        <w:t xml:space="preserve"> </w:t>
-      </w:r>
-      <w:proofErr w:type="spellStart"/>
-      <w:r>
-        <w:rPr>
-          <w:rFonts w:asciiTheme="minorHAnsi" w:eastAsia="Calibri" w:hAnsiTheme="minorHAnsi" w:cstheme="minorHAnsi"/>
-          <w:color w:val="222222"/>
-          <w:sz w:val="19"/>
-          <w:szCs w:val="19"/>
-        </w:rPr>
-        <w:t>Paypal</w:t>
-      </w:r>
-      <w:proofErr w:type="spellEnd"/>
-      <w:r>
-        <w:rPr>
-          <w:rFonts w:asciiTheme="minorHAnsi" w:eastAsia="Calibri" w:hAnsiTheme="minorHAnsi" w:cstheme="minorHAnsi"/>
-          <w:color w:val="222222"/>
-          <w:sz w:val="19"/>
-          <w:szCs w:val="19"/>
-        </w:rPr>
-        <w:t xml:space="preserve">, </w:t>
-      </w:r>
-      <w:proofErr w:type="spellStart"/>
-      <w:r>
-        <w:rPr>
-          <w:rFonts w:asciiTheme="minorHAnsi" w:eastAsia="Calibri" w:hAnsiTheme="minorHAnsi" w:cstheme="minorHAnsi"/>
-          <w:color w:val="222222"/>
-          <w:sz w:val="19"/>
-          <w:szCs w:val="19"/>
-        </w:rPr>
-        <w:t>Razorpa</w:t>
-      </w:r>
-      <w:r>
-        <w:rPr>
-          <w:rFonts w:asciiTheme="minorHAnsi" w:eastAsia="Calibri" w:hAnsiTheme="minorHAnsi" w:cstheme="minorHAnsi"/>
-          <w:color w:val="222222"/>
-          <w:sz w:val="19"/>
-          <w:szCs w:val="19"/>
-        </w:rPr>
-        <w:t>y</w:t>
-      </w:r>
-      <w:proofErr w:type="spellEnd"/>
-      <w:r>
-        <w:rPr>
-          <w:rFonts w:asciiTheme="minorHAnsi" w:eastAsia="Calibri" w:hAnsiTheme="minorHAnsi" w:cstheme="minorHAnsi"/>
-          <w:color w:val="222222"/>
-          <w:sz w:val="19"/>
-          <w:szCs w:val="19"/>
-        </w:rPr>
-        <w:t>,</w:t>
-      </w:r>
-      <w:r>
-        <w:rPr>
-          <w:rFonts w:asciiTheme="minorHAnsi" w:eastAsia="Calibri" w:hAnsiTheme="minorHAnsi" w:cstheme="minorHAnsi"/>
-          <w:color w:val="222222"/>
-          <w:sz w:val="19"/>
-          <w:szCs w:val="19"/>
-        </w:rPr>
-        <w:t xml:space="preserve"> Pusher</w:t>
-      </w:r>
-      <w:r>
-        <w:rPr>
-          <w:rFonts w:asciiTheme="minorHAnsi" w:eastAsia="Calibri" w:hAnsiTheme="minorHAnsi" w:cstheme="minorHAnsi"/>
-          <w:color w:val="222222"/>
-          <w:sz w:val="19"/>
-          <w:szCs w:val="19"/>
-        </w:rPr>
-        <w:t>,</w:t>
-      </w:r>
-      <w:r>
-        <w:rPr>
-          <w:rFonts w:asciiTheme="minorHAnsi" w:eastAsia="Calibri" w:hAnsiTheme="minorHAnsi" w:cstheme="minorHAnsi"/>
-          <w:color w:val="222222"/>
-          <w:sz w:val="19"/>
-          <w:szCs w:val="19"/>
-        </w:rPr>
-        <w:t xml:space="preserve"> Firebase,</w:t>
-      </w:r>
-      <w:r>
-        <w:rPr>
-          <w:rFonts w:asciiTheme="minorHAnsi" w:eastAsia="Calibri" w:hAnsiTheme="minorHAnsi" w:cstheme="minorHAnsi"/>
-          <w:color w:val="222222"/>
-          <w:sz w:val="19"/>
-          <w:szCs w:val="19"/>
-        </w:rPr>
-        <w:t xml:space="preserve"> Twilio, OpenAI API, Google Maps</w:t>
+        <w:t xml:space="preserve"> WhatsApp Business API, Stripe, Paypal, Razorpay, Pusher, Firebase, Twilio, OpenAI API, Google Maps</w:t>
       </w:r>
     </w:p>
     <w:p>
@@ -804,9 +512,9 @@
         <w:pStyle w:val="ListParagraph"/>
         <w:numPr>
           <w:ilvl w:val="0"/>
-          <w:numId w:val="13"/>
+          <w:numId w:val="19"/>
         </w:numPr>
-        <w:spacing w:before="120" w:after="40" w:line="276" w:lineRule="auto"/>
+        <w:spacing w:before="80" w:after="40" w:line="276" w:lineRule="auto"/>
         <w:jc w:val="both"/>
         <w:rPr>
           <w:rFonts w:asciiTheme="minorHAnsi" w:hAnsiTheme="minorHAnsi" w:cstheme="minorHAnsi"/>
@@ -869,9 +577,9 @@
         <w:pStyle w:val="ListParagraph"/>
         <w:numPr>
           <w:ilvl w:val="0"/>
-          <w:numId w:val="13"/>
+          <w:numId w:val="19"/>
         </w:numPr>
-        <w:spacing w:before="120" w:after="40" w:line="276" w:lineRule="auto"/>
+        <w:spacing w:before="80" w:after="40" w:line="276" w:lineRule="auto"/>
         <w:jc w:val="both"/>
         <w:rPr>
           <w:rFonts w:asciiTheme="minorHAnsi" w:eastAsia="Calibri" w:hAnsiTheme="minorHAnsi" w:cstheme="minorHAnsi"/>
@@ -907,43 +615,7 @@
           <w:sz w:val="19"/>
           <w:szCs w:val="19"/>
         </w:rPr>
-        <w:t xml:space="preserve"> REST APIs powering </w:t>
-      </w:r>
-      <w:r>
-        <w:rPr>
-          <w:rFonts w:asciiTheme="minorHAnsi" w:eastAsia="Calibri" w:hAnsiTheme="minorHAnsi" w:cstheme="minorHAnsi"/>
-          <w:color w:val="222222"/>
-          <w:sz w:val="19"/>
-          <w:szCs w:val="19"/>
-        </w:rPr>
-        <w:t>multiple</w:t>
-      </w:r>
-      <w:r>
-        <w:rPr>
-          <w:rFonts w:asciiTheme="minorHAnsi" w:eastAsia="Calibri" w:hAnsiTheme="minorHAnsi" w:cstheme="minorHAnsi"/>
-          <w:color w:val="222222"/>
-          <w:sz w:val="19"/>
-          <w:szCs w:val="19"/>
-        </w:rPr>
-        <w:t xml:space="preserve"> SaaS modules, handling 10k+ concurrent users with &lt;200ms p95 latency on AWS EC2 + RDS; also powered</w:t>
-      </w:r>
-      <w:r>
-        <w:rPr>
-          <w:rFonts w:asciiTheme="minorHAnsi" w:eastAsia="Calibri" w:hAnsiTheme="minorHAnsi" w:cstheme="minorHAnsi"/>
-          <w:color w:val="222222"/>
-          <w:sz w:val="19"/>
-          <w:szCs w:val="19"/>
-        </w:rPr>
-        <w:t xml:space="preserve"> more than 50</w:t>
-      </w:r>
-      <w:r>
-        <w:rPr>
-          <w:rFonts w:asciiTheme="minorHAnsi" w:eastAsia="Calibri" w:hAnsiTheme="minorHAnsi" w:cstheme="minorHAnsi"/>
-          <w:color w:val="222222"/>
-          <w:sz w:val="19"/>
-          <w:szCs w:val="19"/>
-        </w:rPr>
-        <w:t xml:space="preserve"> mobile apps with secure API layers. </w:t>
+        <w:t xml:space="preserve"> REST APIs powering multiple SaaS modules, handling 10k+ concurrent users with &lt;200ms p95 latency on AWS EC2 + RDS; also powered more than 50 mobile apps with secure API layers. </w:t>
       </w:r>
     </w:p>
     <w:p>
@@ -951,9 +623,9 @@
         <w:pStyle w:val="ListParagraph"/>
         <w:numPr>
           <w:ilvl w:val="0"/>
-          <w:numId w:val="13"/>
+          <w:numId w:val="19"/>
         </w:numPr>
-        <w:spacing w:before="120" w:after="40" w:line="276" w:lineRule="auto"/>
+        <w:spacing w:before="80" w:after="40" w:line="276" w:lineRule="auto"/>
         <w:jc w:val="both"/>
         <w:rPr>
           <w:rFonts w:asciiTheme="minorHAnsi" w:eastAsia="Calibri" w:hAnsiTheme="minorHAnsi" w:cstheme="minorHAnsi"/>
@@ -1017,9 +689,9 @@
         <w:pStyle w:val="ListParagraph"/>
         <w:numPr>
           <w:ilvl w:val="0"/>
-          <w:numId w:val="13"/>
+          <w:numId w:val="19"/>
         </w:numPr>
-        <w:spacing w:before="120" w:after="40" w:line="276" w:lineRule="auto"/>
+        <w:spacing w:before="80" w:after="40" w:line="276" w:lineRule="auto"/>
         <w:jc w:val="both"/>
         <w:rPr>
           <w:rFonts w:asciiTheme="minorHAnsi" w:eastAsia="Calibri" w:hAnsiTheme="minorHAnsi" w:cstheme="minorHAnsi"/>
@@ -1163,9 +835,9 @@
         <w:pStyle w:val="ListParagraph"/>
         <w:numPr>
           <w:ilvl w:val="0"/>
-          <w:numId w:val="13"/>
+          <w:numId w:val="19"/>
         </w:numPr>
-        <w:spacing w:before="120" w:after="40" w:line="276" w:lineRule="auto"/>
+        <w:spacing w:before="80" w:after="40" w:line="276" w:lineRule="auto"/>
         <w:jc w:val="both"/>
         <w:rPr>
           <w:rFonts w:asciiTheme="minorHAnsi" w:eastAsia="Calibri" w:hAnsiTheme="minorHAnsi" w:cstheme="minorHAnsi"/>
@@ -1201,43 +873,7 @@
           <w:sz w:val="19"/>
           <w:szCs w:val="19"/>
         </w:rPr>
-        <w:t>-based SPAs with</w:t>
-      </w:r>
-      <w:r>
-        <w:rPr>
-          <w:rFonts w:asciiTheme="minorHAnsi" w:eastAsia="Calibri" w:hAnsiTheme="minorHAnsi" w:cstheme="minorHAnsi"/>
-          <w:color w:val="222222"/>
-          <w:sz w:val="19"/>
-          <w:szCs w:val="19"/>
-        </w:rPr>
-        <w:t xml:space="preserve"> frontend and backend on Laravel and Node.js with</w:t>
-      </w:r>
-      <w:r>
-        <w:rPr>
-          <w:rFonts w:asciiTheme="minorHAnsi" w:eastAsia="Calibri" w:hAnsiTheme="minorHAnsi" w:cstheme="minorHAnsi"/>
-          <w:color w:val="222222"/>
-          <w:sz w:val="19"/>
-          <w:szCs w:val="19"/>
-        </w:rPr>
-        <w:t xml:space="preserve"> real-time dashboards for </w:t>
-      </w:r>
-      <w:r>
-        <w:rPr>
-          <w:rFonts w:asciiTheme="minorHAnsi" w:eastAsia="Calibri" w:hAnsiTheme="minorHAnsi" w:cstheme="minorHAnsi"/>
-          <w:color w:val="222222"/>
-          <w:sz w:val="19"/>
-          <w:szCs w:val="19"/>
-        </w:rPr>
-        <w:t>multiple websites</w:t>
-      </w:r>
-      <w:r>
-        <w:rPr>
-          <w:rFonts w:asciiTheme="minorHAnsi" w:eastAsia="Calibri" w:hAnsiTheme="minorHAnsi" w:cstheme="minorHAnsi"/>
-          <w:color w:val="222222"/>
-          <w:sz w:val="19"/>
-          <w:szCs w:val="19"/>
-        </w:rPr>
-        <w:t xml:space="preserve">, cutting client-reported UI bugs by 45% through unit testing. </w:t>
+        <w:t xml:space="preserve">-based SPAs with frontend and backend on Laravel and Node.js with real-time dashboards for multiple websites, cutting client-reported UI bugs by 45% through unit testing. </w:t>
       </w:r>
     </w:p>
     <w:p>
@@ -1245,9 +881,9 @@
         <w:pStyle w:val="ListParagraph"/>
         <w:numPr>
           <w:ilvl w:val="0"/>
-          <w:numId w:val="13"/>
+          <w:numId w:val="19"/>
         </w:numPr>
-        <w:spacing w:before="120" w:after="40" w:line="276" w:lineRule="auto"/>
+        <w:spacing w:before="80" w:after="40" w:line="276" w:lineRule="auto"/>
         <w:jc w:val="both"/>
         <w:rPr>
           <w:rFonts w:asciiTheme="minorHAnsi" w:eastAsia="Calibri" w:hAnsiTheme="minorHAnsi" w:cstheme="minorHAnsi"/>
@@ -1285,27 +921,7 @@
           <w:sz w:val="19"/>
           <w:szCs w:val="19"/>
         </w:rPr>
-        <w:t xml:space="preserve"> (Puppeteer) for chemical/pharmaceutical supplier </w:t>
-      </w:r>
-      <w:proofErr w:type="spellStart"/>
-      <w:r>
-        <w:rPr>
-          <w:rFonts w:asciiTheme="minorHAnsi" w:eastAsia="Calibri" w:hAnsiTheme="minorHAnsi" w:cstheme="minorHAnsi"/>
-          <w:color w:val="222222"/>
-          <w:sz w:val="19"/>
-          <w:szCs w:val="19"/>
-        </w:rPr>
-        <w:t>catalogs</w:t>
-      </w:r>
-      <w:proofErr w:type="spellEnd"/>
-      <w:r>
-        <w:rPr>
-          <w:rFonts w:asciiTheme="minorHAnsi" w:eastAsia="Calibri" w:hAnsiTheme="minorHAnsi" w:cstheme="minorHAnsi"/>
-          <w:color w:val="222222"/>
-          <w:sz w:val="19"/>
-          <w:szCs w:val="19"/>
-        </w:rPr>
-        <w:t>, processing 50k+ SKUs with anti-blocking measures, alongside JWT/OAuth and CSRF/XSS hardening with zero post-launch security incidents.</w:t>
+        <w:t xml:space="preserve"> (Puppeteer) for chemical/pharmaceutical supplier catalogs, processing 50k+ SKUs with anti-blocking measures, alongside JWT/OAuth and CSRF/XSS hardening with zero post-launch security incidents.</w:t>
       </w:r>
       <w:r>
         <w:rPr>
@@ -1365,35 +981,23 @@
         <w:pStyle w:val="ListParagraph"/>
         <w:numPr>
           <w:ilvl w:val="0"/>
-          <w:numId w:val="18"/>
+          <w:numId w:val="19"/>
         </w:numPr>
-      </w:pPr>
-      <w:r>
-        <w:t>Built Laravel + MySQL backends for CRM and e-commerce platforms (</w:t>
-      </w:r>
-      <w:proofErr w:type="spellStart"/>
-      <w:r>
-        <w:t>Swissvans</w:t>
-      </w:r>
-      <w:proofErr w:type="spellEnd"/>
-      <w:r>
-        <w:t xml:space="preserve">, Trostaparkering, </w:t>
-      </w:r>
-      <w:proofErr w:type="spellStart"/>
-      <w:r>
-        <w:t>Mosaiekexpo</w:t>
-      </w:r>
-      <w:proofErr w:type="spellEnd"/>
-      <w:r>
-        <w:t xml:space="preserve">, </w:t>
-      </w:r>
-      <w:proofErr w:type="spellStart"/>
-      <w:r>
-        <w:t>Greattutors</w:t>
-      </w:r>
-      <w:proofErr w:type="spellEnd"/>
-      <w:r>
-        <w:t xml:space="preserve">), supporting 10,000 active users across 3 countries. </w:t>
+        <w:spacing w:before="80" w:after="40" w:line="276" w:lineRule="auto"/>
+        <w:jc w:val="both"/>
+        <w:rPr>
+          <w:rFonts w:asciiTheme="minorHAnsi" w:eastAsia="Calibri" w:hAnsiTheme="minorHAnsi" w:cstheme="minorHAnsi"/>
+          <w:sz w:val="19"/>
+          <w:szCs w:val="19"/>
+        </w:rPr>
+      </w:pPr>
+      <w:r>
+        <w:rPr>
+          <w:rFonts w:asciiTheme="minorHAnsi" w:eastAsia="Calibri" w:hAnsiTheme="minorHAnsi" w:cstheme="minorHAnsi"/>
+          <w:sz w:val="19"/>
+          <w:szCs w:val="19"/>
+        </w:rPr>
+        <w:t xml:space="preserve">Built Laravel + MySQL backends for CRM and e-commerce platforms (Swissvans, Trostaparkering, Mosaiekexpo, Greattutors), supporting 10,000 active users across 3 countries. </w:t>
       </w:r>
     </w:p>
     <w:p>
@@ -1401,10 +1005,22 @@
         <w:pStyle w:val="ListParagraph"/>
         <w:numPr>
           <w:ilvl w:val="0"/>
-          <w:numId w:val="18"/>
+          <w:numId w:val="19"/>
         </w:numPr>
-      </w:pPr>
-      <w:r>
+        <w:spacing w:before="80" w:after="40" w:line="276" w:lineRule="auto"/>
+        <w:jc w:val="both"/>
+        <w:rPr>
+          <w:rFonts w:asciiTheme="minorHAnsi" w:eastAsia="Calibri" w:hAnsiTheme="minorHAnsi" w:cstheme="minorHAnsi"/>
+          <w:sz w:val="19"/>
+          <w:szCs w:val="19"/>
+        </w:rPr>
+      </w:pPr>
+      <w:r>
+        <w:rPr>
+          <w:rFonts w:asciiTheme="minorHAnsi" w:eastAsia="Calibri" w:hAnsiTheme="minorHAnsi" w:cstheme="minorHAnsi"/>
+          <w:sz w:val="19"/>
+          <w:szCs w:val="19"/>
+        </w:rPr>
         <w:t xml:space="preserve">Developed Node.js RESTful integrations and dynamic WordPress themes for 12 client projects, reducing average delivery time by 30% through reusable component libraries. </w:t>
       </w:r>
     </w:p>
@@ -1413,10 +1029,22 @@
         <w:pStyle w:val="ListParagraph"/>
         <w:numPr>
           <w:ilvl w:val="0"/>
-          <w:numId w:val="18"/>
+          <w:numId w:val="19"/>
         </w:numPr>
-      </w:pPr>
-      <w:r>
+        <w:spacing w:before="80" w:after="40" w:line="276" w:lineRule="auto"/>
+        <w:jc w:val="both"/>
+        <w:rPr>
+          <w:rFonts w:asciiTheme="minorHAnsi" w:eastAsia="Calibri" w:hAnsiTheme="minorHAnsi" w:cstheme="minorHAnsi"/>
+          <w:sz w:val="19"/>
+          <w:szCs w:val="19"/>
+        </w:rPr>
+      </w:pPr>
+      <w:r>
+        <w:rPr>
+          <w:rFonts w:asciiTheme="minorHAnsi" w:eastAsia="Calibri" w:hAnsiTheme="minorHAnsi" w:cstheme="minorHAnsi"/>
+          <w:sz w:val="19"/>
+          <w:szCs w:val="19"/>
+        </w:rPr>
         <w:t xml:space="preserve">Wrote Eloquent ORM query optimisations for KPI/renewals dashboard (insurance domain), cutting report load time from 8s to &lt;1s via indexed queries and eager loading. </w:t>
       </w:r>
     </w:p>
@@ -1425,19 +1053,23 @@
         <w:pStyle w:val="ListParagraph"/>
         <w:numPr>
           <w:ilvl w:val="0"/>
-          <w:numId w:val="18"/>
+          <w:numId w:val="19"/>
         </w:numPr>
-      </w:pPr>
-      <w:r>
-        <w:t>Collaborated with cross-functional teams using Git branching strategies (</w:t>
-      </w:r>
-      <w:proofErr w:type="spellStart"/>
-      <w:r>
-        <w:t>GitFlow</w:t>
-      </w:r>
-      <w:proofErr w:type="spellEnd"/>
-      <w:r>
-        <w:t xml:space="preserve">), maintaining clean PR history across 15 active repositories. </w:t>
+        <w:spacing w:before="80" w:after="40" w:line="276" w:lineRule="auto"/>
+        <w:jc w:val="both"/>
+        <w:rPr>
+          <w:rFonts w:asciiTheme="minorHAnsi" w:eastAsia="Calibri" w:hAnsiTheme="minorHAnsi" w:cstheme="minorHAnsi"/>
+          <w:sz w:val="19"/>
+          <w:szCs w:val="19"/>
+        </w:rPr>
+      </w:pPr>
+      <w:r>
+        <w:rPr>
+          <w:rFonts w:asciiTheme="minorHAnsi" w:eastAsia="Calibri" w:hAnsiTheme="minorHAnsi" w:cstheme="minorHAnsi"/>
+          <w:sz w:val="19"/>
+          <w:szCs w:val="19"/>
+        </w:rPr>
+        <w:t xml:space="preserve">Collaborated with cross-functional teams using Git branching strategies (GitFlow), maintaining clean PR history across 15 active repositories. </w:t>
       </w:r>
     </w:p>
     <w:p>
@@ -1445,10 +1077,22 @@
         <w:pStyle w:val="ListParagraph"/>
         <w:numPr>
           <w:ilvl w:val="0"/>
-          <w:numId w:val="18"/>
+          <w:numId w:val="19"/>
         </w:numPr>
-      </w:pPr>
-      <w:r>
+        <w:spacing w:before="80" w:after="40" w:line="276" w:lineRule="auto"/>
+        <w:jc w:val="both"/>
+        <w:rPr>
+          <w:rFonts w:asciiTheme="minorHAnsi" w:eastAsia="Calibri" w:hAnsiTheme="minorHAnsi" w:cstheme="minorHAnsi"/>
+          <w:sz w:val="19"/>
+          <w:szCs w:val="19"/>
+        </w:rPr>
+      </w:pPr>
+      <w:r>
+        <w:rPr>
+          <w:rFonts w:asciiTheme="minorHAnsi" w:eastAsia="Calibri" w:hAnsiTheme="minorHAnsi" w:cstheme="minorHAnsi"/>
+          <w:sz w:val="19"/>
+          <w:szCs w:val="19"/>
+        </w:rPr>
         <w:t xml:space="preserve">Designed responsive, cross-browser UI for client-facing portals, improving mobile usability and reducing bounce rates by 25%. </w:t>
       </w:r>
     </w:p>
@@ -1457,10 +1101,23 @@
         <w:pStyle w:val="ListParagraph"/>
         <w:numPr>
           <w:ilvl w:val="0"/>
-          <w:numId w:val="18"/>
+          <w:numId w:val="19"/>
         </w:numPr>
-      </w:pPr>
-      <w:r>
+        <w:spacing w:before="80" w:after="40" w:line="276" w:lineRule="auto"/>
+        <w:jc w:val="both"/>
+        <w:rPr>
+          <w:rFonts w:asciiTheme="minorHAnsi" w:eastAsia="Calibri" w:hAnsiTheme="minorHAnsi" w:cstheme="minorHAnsi"/>
+          <w:sz w:val="19"/>
+          <w:szCs w:val="19"/>
+        </w:rPr>
+      </w:pPr>
+      <w:r>
+        <w:rPr>
+          <w:rFonts w:asciiTheme="minorHAnsi" w:eastAsia="Calibri" w:hAnsiTheme="minorHAnsi" w:cstheme="minorHAnsi"/>
+          <w:sz w:val="19"/>
+          <w:szCs w:val="19"/>
+        </w:rPr>
+        <w:lastRenderedPageBreak/>
         <w:t>Implemented automated database backups and deployment scripts, cutting release-related downtime by 40% across managed projects.</w:t>
       </w:r>
     </w:p>
@@ -1471,10 +1128,685 @@
         </w:pBdr>
         <w:spacing w:before="180" w:after="80" w:line="276" w:lineRule="auto"/>
         <w:rPr>
+          <w:rFonts w:asciiTheme="minorHAnsi" w:hAnsiTheme="minorHAnsi" w:cstheme="minorHAnsi"/>
+          <w:sz w:val="19"/>
+          <w:szCs w:val="19"/>
+        </w:rPr>
+      </w:pPr>
+      <w:r>
+        <w:rPr>
           <w:rFonts w:asciiTheme="minorHAnsi" w:eastAsia="Calibri" w:hAnsiTheme="minorHAnsi" w:cstheme="minorHAnsi"/>
           <w:b/>
           <w:bCs/>
           <w:color w:val="1F3864"/>
+          <w:sz w:val="19"/>
+          <w:szCs w:val="19"/>
+        </w:rPr>
+        <w:t>KEY PROJECTS</w:t>
+      </w:r>
+    </w:p>
+    <w:p>
+      <w:pPr>
+        <w:spacing w:before="80" w:after="40" w:line="276" w:lineRule="auto"/>
+        <w:rPr>
+          <w:rFonts w:asciiTheme="minorHAnsi" w:hAnsiTheme="minorHAnsi" w:cstheme="minorHAnsi"/>
+          <w:sz w:val="19"/>
+          <w:szCs w:val="19"/>
+        </w:rPr>
+      </w:pPr>
+      <w:r>
+        <w:rPr>
+          <w:rFonts w:asciiTheme="minorHAnsi" w:eastAsia="Calibri" w:hAnsiTheme="minorHAnsi" w:cstheme="minorHAnsi"/>
+          <w:b/>
+          <w:bCs/>
+          <w:color w:val="222222"/>
+          <w:sz w:val="19"/>
+          <w:szCs w:val="19"/>
+        </w:rPr>
+        <w:t>Swissvans.com</w:t>
+      </w:r>
+      <w:r>
+        <w:rPr>
+          <w:rFonts w:asciiTheme="minorHAnsi" w:eastAsia="Calibri" w:hAnsiTheme="minorHAnsi" w:cstheme="minorHAnsi"/>
+          <w:color w:val="222222"/>
+          <w:sz w:val="19"/>
+          <w:szCs w:val="19"/>
+        </w:rPr>
+        <w:t xml:space="preserve"> — Website for UK Based Van Leasing Company </w:t>
+      </w:r>
+      <w:r>
+        <w:rPr>
+          <w:rFonts w:asciiTheme="minorHAnsi" w:eastAsia="Calibri" w:hAnsiTheme="minorHAnsi" w:cstheme="minorHAnsi"/>
+          <w:i/>
+          <w:iCs/>
+          <w:color w:val="222222"/>
+          <w:sz w:val="19"/>
+          <w:szCs w:val="19"/>
+        </w:rPr>
+        <w:t>(Laravel · Next.js · MySQL · AWS)</w:t>
+      </w:r>
+    </w:p>
+    <w:p>
+      <w:pPr>
+        <w:pStyle w:val="ListParagraph"/>
+        <w:numPr>
+          <w:ilvl w:val="0"/>
+          <w:numId w:val="19"/>
+        </w:numPr>
+        <w:spacing w:before="80" w:after="40" w:line="276" w:lineRule="auto"/>
+        <w:jc w:val="both"/>
+        <w:rPr>
+          <w:rFonts w:asciiTheme="minorHAnsi" w:hAnsiTheme="minorHAnsi" w:cstheme="minorHAnsi"/>
+          <w:sz w:val="19"/>
+          <w:szCs w:val="19"/>
+        </w:rPr>
+      </w:pPr>
+      <w:r>
+        <w:rPr>
+          <w:rFonts w:asciiTheme="minorHAnsi" w:eastAsia="Calibri" w:hAnsiTheme="minorHAnsi" w:cstheme="minorHAnsi"/>
+          <w:color w:val="222222"/>
+          <w:sz w:val="19"/>
+          <w:szCs w:val="19"/>
+        </w:rPr>
+        <w:t xml:space="preserve"> </w:t>
+      </w:r>
+      <w:r>
+        <w:rPr>
+          <w:rFonts w:asciiTheme="minorHAnsi" w:eastAsia="Calibri" w:hAnsiTheme="minorHAnsi" w:cstheme="minorHAnsi"/>
+          <w:b/>
+          <w:bCs/>
+          <w:color w:val="222222"/>
+          <w:sz w:val="19"/>
+          <w:szCs w:val="19"/>
+        </w:rPr>
+        <w:t>Laravel Backend:</w:t>
+      </w:r>
+      <w:r>
+        <w:rPr>
+          <w:rFonts w:asciiTheme="minorHAnsi" w:eastAsia="Calibri" w:hAnsiTheme="minorHAnsi" w:cstheme="minorHAnsi"/>
+          <w:color w:val="222222"/>
+          <w:sz w:val="19"/>
+          <w:szCs w:val="19"/>
+        </w:rPr>
+        <w:t xml:space="preserve"> Implements the core REST API handling scheduling, constraints, and triggering real-time WebSocket events via Laravel Reverb/Pusher when shift assignments change.</w:t>
+      </w:r>
+    </w:p>
+    <w:p>
+      <w:pPr>
+        <w:pStyle w:val="ListParagraph"/>
+        <w:numPr>
+          <w:ilvl w:val="0"/>
+          <w:numId w:val="19"/>
+        </w:numPr>
+        <w:spacing w:before="80" w:after="40" w:line="276" w:lineRule="auto"/>
+        <w:jc w:val="both"/>
+        <w:rPr>
+          <w:rFonts w:asciiTheme="minorHAnsi" w:hAnsiTheme="minorHAnsi" w:cstheme="minorHAnsi"/>
+          <w:sz w:val="19"/>
+          <w:szCs w:val="19"/>
+        </w:rPr>
+      </w:pPr>
+      <w:r>
+        <w:rPr>
+          <w:rFonts w:asciiTheme="minorHAnsi" w:eastAsia="Calibri" w:hAnsiTheme="minorHAnsi" w:cstheme="minorHAnsi"/>
+          <w:color w:val="222222"/>
+          <w:sz w:val="19"/>
+          <w:szCs w:val="19"/>
+        </w:rPr>
+        <w:t xml:space="preserve"> </w:t>
+      </w:r>
+      <w:r>
+        <w:rPr>
+          <w:rFonts w:asciiTheme="minorHAnsi" w:eastAsia="Calibri" w:hAnsiTheme="minorHAnsi" w:cstheme="minorHAnsi"/>
+          <w:b/>
+          <w:bCs/>
+          <w:color w:val="222222"/>
+          <w:sz w:val="19"/>
+          <w:szCs w:val="19"/>
+        </w:rPr>
+        <w:t>Next.js Frontend:</w:t>
+      </w:r>
+      <w:r>
+        <w:rPr>
+          <w:rFonts w:asciiTheme="minorHAnsi" w:eastAsia="Calibri" w:hAnsiTheme="minorHAnsi" w:cstheme="minorHAnsi"/>
+          <w:color w:val="222222"/>
+          <w:sz w:val="19"/>
+          <w:szCs w:val="19"/>
+        </w:rPr>
+        <w:t xml:space="preserve"> Provides a reactive, state-managed schedule UI that listens to live backend broadcasts to update employee shifts instantly without requiring page refreshes.</w:t>
+      </w:r>
+    </w:p>
+    <w:p>
+      <w:pPr>
+        <w:pStyle w:val="ListParagraph"/>
+        <w:spacing w:after="50" w:line="276" w:lineRule="auto"/>
+        <w:ind w:left="480"/>
+        <w:rPr>
+          <w:rFonts w:asciiTheme="minorHAnsi" w:hAnsiTheme="minorHAnsi" w:cstheme="minorHAnsi"/>
+          <w:sz w:val="19"/>
+          <w:szCs w:val="19"/>
+        </w:rPr>
+      </w:pPr>
+    </w:p>
+    <w:p>
+      <w:pPr>
+        <w:spacing w:before="80" w:after="40" w:line="276" w:lineRule="auto"/>
+        <w:rPr>
+          <w:rFonts w:asciiTheme="minorHAnsi" w:eastAsia="Calibri" w:hAnsiTheme="minorHAnsi" w:cstheme="minorHAnsi"/>
+          <w:color w:val="222222"/>
+          <w:sz w:val="19"/>
+          <w:szCs w:val="19"/>
+        </w:rPr>
+      </w:pPr>
+      <w:r>
+        <w:rPr>
+          <w:rFonts w:asciiTheme="minorHAnsi" w:eastAsia="Calibri" w:hAnsiTheme="minorHAnsi" w:cstheme="minorHAnsi"/>
+          <w:b/>
+          <w:bCs/>
+          <w:color w:val="222222"/>
+          <w:sz w:val="19"/>
+          <w:szCs w:val="19"/>
+        </w:rPr>
+        <w:t xml:space="preserve">Trostaparkering.se </w:t>
+      </w:r>
+      <w:r>
+        <w:rPr>
+          <w:rFonts w:asciiTheme="minorHAnsi" w:eastAsia="Calibri" w:hAnsiTheme="minorHAnsi" w:cstheme="minorHAnsi"/>
+          <w:color w:val="222222"/>
+          <w:sz w:val="19"/>
+          <w:szCs w:val="19"/>
+        </w:rPr>
+        <w:t xml:space="preserve">— Website for Sweden Based Parking Company </w:t>
+      </w:r>
+      <w:r>
+        <w:rPr>
+          <w:rFonts w:asciiTheme="minorHAnsi" w:eastAsia="Calibri" w:hAnsiTheme="minorHAnsi" w:cstheme="minorHAnsi"/>
+          <w:i/>
+          <w:iCs/>
+          <w:color w:val="222222"/>
+          <w:sz w:val="19"/>
+          <w:szCs w:val="19"/>
+        </w:rPr>
+        <w:t>(Laravel · Next.js · MySQL · AWS)</w:t>
+      </w:r>
+    </w:p>
+    <w:p>
+      <w:pPr>
+        <w:pStyle w:val="ListParagraph"/>
+        <w:numPr>
+          <w:ilvl w:val="0"/>
+          <w:numId w:val="19"/>
+        </w:numPr>
+        <w:spacing w:before="80" w:after="40" w:line="276" w:lineRule="auto"/>
+        <w:jc w:val="both"/>
+        <w:rPr>
+          <w:rFonts w:asciiTheme="minorHAnsi" w:hAnsiTheme="minorHAnsi" w:cstheme="minorHAnsi"/>
+          <w:sz w:val="19"/>
+          <w:szCs w:val="19"/>
+        </w:rPr>
+      </w:pPr>
+      <w:r>
+        <w:rPr>
+          <w:rFonts w:asciiTheme="minorHAnsi" w:eastAsia="Calibri" w:hAnsiTheme="minorHAnsi" w:cstheme="minorHAnsi"/>
+          <w:b/>
+          <w:bCs/>
+          <w:color w:val="222222"/>
+          <w:sz w:val="19"/>
+          <w:szCs w:val="19"/>
+        </w:rPr>
+        <w:t>Laravel Backend:</w:t>
+      </w:r>
+      <w:r>
+        <w:rPr>
+          <w:rFonts w:asciiTheme="minorHAnsi" w:eastAsia="Calibri" w:hAnsiTheme="minorHAnsi" w:cstheme="minorHAnsi"/>
+          <w:color w:val="222222"/>
+          <w:sz w:val="19"/>
+          <w:szCs w:val="19"/>
+        </w:rPr>
+        <w:t xml:space="preserve"> Powers a performance-optimized, multilingual API driving localized content routing, while executing a high-throughput data pipeline that scrapes, parses PDFs, and normalizes 50k+ parking SKUs for Excel export.</w:t>
+      </w:r>
+    </w:p>
+    <w:p>
+      <w:pPr>
+        <w:pStyle w:val="ListParagraph"/>
+        <w:numPr>
+          <w:ilvl w:val="0"/>
+          <w:numId w:val="19"/>
+        </w:numPr>
+        <w:spacing w:before="80" w:after="40" w:line="276" w:lineRule="auto"/>
+        <w:jc w:val="both"/>
+        <w:rPr>
+          <w:rFonts w:asciiTheme="minorHAnsi" w:hAnsiTheme="minorHAnsi" w:cstheme="minorHAnsi"/>
+          <w:sz w:val="19"/>
+          <w:szCs w:val="19"/>
+        </w:rPr>
+      </w:pPr>
+      <w:r>
+        <w:rPr>
+          <w:rFonts w:asciiTheme="minorHAnsi" w:hAnsiTheme="minorHAnsi" w:cstheme="minorHAnsi"/>
+          <w:b/>
+          <w:bCs/>
+          <w:sz w:val="19"/>
+          <w:szCs w:val="19"/>
+        </w:rPr>
+        <w:t>Next.js Frontend:</w:t>
+      </w:r>
+      <w:r>
+        <w:rPr>
+          <w:rFonts w:asciiTheme="minorHAnsi" w:hAnsiTheme="minorHAnsi" w:cstheme="minorHAnsi"/>
+          <w:sz w:val="19"/>
+          <w:szCs w:val="19"/>
+        </w:rPr>
+        <w:t xml:space="preserve"> Delivers a blazing-fast, SEO-optimized multilingual user experience across Sweden, leveraging advanced caching, server-side localized rendering (SSR), and smooth static generation to handle high-traffic parkers efficiently.</w:t>
+      </w:r>
+    </w:p>
+    <w:p>
+      <w:pPr>
+        <w:pStyle w:val="ListParagraph"/>
+        <w:spacing w:before="80" w:after="40" w:line="276" w:lineRule="auto"/>
+        <w:ind w:left="720"/>
+        <w:rPr>
+          <w:rFonts w:asciiTheme="minorHAnsi" w:hAnsiTheme="minorHAnsi" w:cstheme="minorHAnsi"/>
+          <w:sz w:val="19"/>
+          <w:szCs w:val="19"/>
+        </w:rPr>
+      </w:pPr>
+    </w:p>
+    <w:p>
+      <w:pPr>
+        <w:spacing w:before="80" w:after="40" w:line="276" w:lineRule="auto"/>
+        <w:rPr>
+          <w:rFonts w:asciiTheme="minorHAnsi" w:hAnsiTheme="minorHAnsi" w:cstheme="minorHAnsi"/>
+          <w:sz w:val="19"/>
+          <w:szCs w:val="19"/>
+        </w:rPr>
+      </w:pPr>
+      <w:r>
+        <w:rPr>
+          <w:rFonts w:asciiTheme="minorHAnsi" w:eastAsia="Calibri" w:hAnsiTheme="minorHAnsi" w:cstheme="minorHAnsi"/>
+          <w:b/>
+          <w:bCs/>
+          <w:color w:val="222222"/>
+          <w:sz w:val="19"/>
+          <w:szCs w:val="19"/>
+        </w:rPr>
+        <w:t xml:space="preserve">Mosaiekexpo.co.za </w:t>
+      </w:r>
+      <w:r>
+        <w:rPr>
+          <w:rFonts w:asciiTheme="minorHAnsi" w:eastAsia="Calibri" w:hAnsiTheme="minorHAnsi" w:cstheme="minorHAnsi"/>
+          <w:color w:val="222222"/>
+          <w:sz w:val="19"/>
+          <w:szCs w:val="19"/>
+        </w:rPr>
+        <w:t>— POS Management SaaS for South Africa based Exhibitions (</w:t>
+      </w:r>
+      <w:r>
+        <w:rPr>
+          <w:rFonts w:asciiTheme="minorHAnsi" w:eastAsia="Calibri" w:hAnsiTheme="minorHAnsi" w:cstheme="minorHAnsi"/>
+          <w:i/>
+          <w:iCs/>
+          <w:color w:val="222222"/>
+          <w:sz w:val="19"/>
+          <w:szCs w:val="19"/>
+        </w:rPr>
+        <w:t>Laravel · Blade · MySQL)</w:t>
+      </w:r>
+    </w:p>
+    <w:p>
+      <w:pPr>
+        <w:pStyle w:val="ListParagraph"/>
+        <w:numPr>
+          <w:ilvl w:val="0"/>
+          <w:numId w:val="19"/>
+        </w:numPr>
+        <w:spacing w:before="80" w:after="40" w:line="276" w:lineRule="auto"/>
+        <w:jc w:val="both"/>
+        <w:rPr>
+          <w:rFonts w:asciiTheme="minorHAnsi" w:eastAsia="Calibri" w:hAnsiTheme="minorHAnsi" w:cstheme="minorHAnsi"/>
+          <w:color w:val="222222"/>
+          <w:sz w:val="19"/>
+          <w:szCs w:val="19"/>
+        </w:rPr>
+      </w:pPr>
+      <w:r>
+        <w:rPr>
+          <w:rFonts w:asciiTheme="minorHAnsi" w:eastAsia="Calibri" w:hAnsiTheme="minorHAnsi" w:cstheme="minorHAnsi"/>
+          <w:b/>
+          <w:bCs/>
+          <w:color w:val="222222"/>
+          <w:sz w:val="19"/>
+          <w:szCs w:val="19"/>
+        </w:rPr>
+        <w:t>Laravel Backend:</w:t>
+      </w:r>
+      <w:r>
+        <w:rPr>
+          <w:rFonts w:asciiTheme="minorHAnsi" w:eastAsia="Calibri" w:hAnsiTheme="minorHAnsi" w:cstheme="minorHAnsi"/>
+          <w:color w:val="222222"/>
+          <w:sz w:val="19"/>
+          <w:szCs w:val="19"/>
+        </w:rPr>
+        <w:t xml:space="preserve"> Powers a performance-optimized system driving automated exhibitor onboarding, digital screening workflows, and a real-time data sync engine that integrates Lightspeed Retail APIs to seamlessly harmonize sales, custom product labelling, and SKU inventories. </w:t>
+      </w:r>
+    </w:p>
+    <w:p>
+      <w:pPr>
+        <w:pStyle w:val="ListParagraph"/>
+        <w:numPr>
+          <w:ilvl w:val="0"/>
+          <w:numId w:val="19"/>
+        </w:numPr>
+        <w:spacing w:before="80" w:after="40" w:line="276" w:lineRule="auto"/>
+        <w:jc w:val="both"/>
+        <w:rPr>
+          <w:rFonts w:asciiTheme="minorHAnsi" w:hAnsiTheme="minorHAnsi" w:cstheme="minorHAnsi"/>
+          <w:sz w:val="19"/>
+          <w:szCs w:val="19"/>
+        </w:rPr>
+      </w:pPr>
+      <w:r>
+        <w:rPr>
+          <w:rFonts w:asciiTheme="minorHAnsi" w:eastAsia="Calibri" w:hAnsiTheme="minorHAnsi" w:cstheme="minorHAnsi"/>
+          <w:b/>
+          <w:bCs/>
+          <w:color w:val="222222"/>
+          <w:sz w:val="19"/>
+          <w:szCs w:val="19"/>
+        </w:rPr>
+        <w:t>Laravel Frontend:</w:t>
+      </w:r>
+      <w:r>
+        <w:rPr>
+          <w:rFonts w:asciiTheme="minorHAnsi" w:eastAsia="Calibri" w:hAnsiTheme="minorHAnsi" w:cstheme="minorHAnsi"/>
+          <w:color w:val="222222"/>
+          <w:sz w:val="19"/>
+          <w:szCs w:val="19"/>
+        </w:rPr>
+        <w:t xml:space="preserve"> Delivers a lightning-fast, high-traffic user experience built with Blade, optimizing page load speeds and registration workflows for hundreds of participating exhibitors and thousands of expo visitors.</w:t>
+      </w:r>
+    </w:p>
+    <w:p>
+      <w:pPr>
+        <w:spacing w:before="80" w:after="40" w:line="276" w:lineRule="auto"/>
+        <w:rPr>
+          <w:rFonts w:asciiTheme="minorHAnsi" w:eastAsia="Calibri" w:hAnsiTheme="minorHAnsi" w:cstheme="minorHAnsi"/>
+          <w:b/>
+          <w:bCs/>
+          <w:color w:val="222222"/>
+          <w:sz w:val="19"/>
+          <w:szCs w:val="19"/>
+        </w:rPr>
+      </w:pPr>
+    </w:p>
+    <w:p>
+      <w:pPr>
+        <w:spacing w:before="80" w:after="40" w:line="276" w:lineRule="auto"/>
+        <w:rPr>
+          <w:rFonts w:asciiTheme="minorHAnsi" w:eastAsia="Calibri" w:hAnsiTheme="minorHAnsi" w:cstheme="minorHAnsi"/>
+          <w:i/>
+          <w:iCs/>
+          <w:color w:val="222222"/>
+          <w:sz w:val="19"/>
+          <w:szCs w:val="19"/>
+        </w:rPr>
+      </w:pPr>
+      <w:r>
+        <w:rPr>
+          <w:rFonts w:asciiTheme="minorHAnsi" w:eastAsia="Calibri" w:hAnsiTheme="minorHAnsi" w:cstheme="minorHAnsi"/>
+          <w:b/>
+          <w:bCs/>
+          <w:color w:val="222222"/>
+          <w:sz w:val="19"/>
+          <w:szCs w:val="19"/>
+        </w:rPr>
+        <w:t xml:space="preserve">Greattutors.net </w:t>
+      </w:r>
+      <w:r>
+        <w:rPr>
+          <w:rFonts w:asciiTheme="minorHAnsi" w:eastAsia="Calibri" w:hAnsiTheme="minorHAnsi" w:cstheme="minorHAnsi"/>
+          <w:color w:val="222222"/>
+          <w:sz w:val="19"/>
+          <w:szCs w:val="19"/>
+        </w:rPr>
+        <w:t>— A LMS (Learning Management System) for London-based tuition centre (</w:t>
+      </w:r>
+      <w:r>
+        <w:rPr>
+          <w:rFonts w:asciiTheme="minorHAnsi" w:eastAsia="Calibri" w:hAnsiTheme="minorHAnsi" w:cstheme="minorHAnsi"/>
+          <w:i/>
+          <w:iCs/>
+          <w:color w:val="222222"/>
+          <w:sz w:val="19"/>
+          <w:szCs w:val="19"/>
+        </w:rPr>
+        <w:t>Laravel · jQuery · MySQL)</w:t>
+      </w:r>
+    </w:p>
+    <w:p>
+      <w:pPr>
+        <w:pStyle w:val="ListParagraph"/>
+        <w:numPr>
+          <w:ilvl w:val="0"/>
+          <w:numId w:val="19"/>
+        </w:numPr>
+        <w:spacing w:before="80" w:after="40" w:line="276" w:lineRule="auto"/>
+        <w:jc w:val="both"/>
+        <w:rPr>
+          <w:rFonts w:asciiTheme="minorHAnsi" w:eastAsia="Calibri" w:hAnsiTheme="minorHAnsi" w:cstheme="minorHAnsi"/>
+          <w:i/>
+          <w:iCs/>
+          <w:color w:val="222222"/>
+          <w:sz w:val="19"/>
+          <w:szCs w:val="19"/>
+        </w:rPr>
+      </w:pPr>
+      <w:r>
+        <w:rPr>
+          <w:rFonts w:asciiTheme="minorHAnsi" w:eastAsia="Calibri" w:hAnsiTheme="minorHAnsi" w:cstheme="minorHAnsi"/>
+          <w:b/>
+          <w:bCs/>
+          <w:color w:val="222222"/>
+          <w:sz w:val="19"/>
+          <w:szCs w:val="19"/>
+        </w:rPr>
+        <w:t xml:space="preserve">Laravel Backend: </w:t>
+      </w:r>
+      <w:r>
+        <w:rPr>
+          <w:rFonts w:asciiTheme="minorHAnsi" w:eastAsia="Calibri" w:hAnsiTheme="minorHAnsi" w:cstheme="minorHAnsi"/>
+          <w:color w:val="222222"/>
+          <w:sz w:val="19"/>
+          <w:szCs w:val="19"/>
+        </w:rPr>
+        <w:t xml:space="preserve">Powers a robust learning management system handling automated homework workflows, recorded video streaming pipelines, and a custom e-commerce engine that dynamically builds personalized exam test papers. </w:t>
+      </w:r>
+    </w:p>
+    <w:p>
+      <w:pPr>
+        <w:pStyle w:val="ListParagraph"/>
+        <w:numPr>
+          <w:ilvl w:val="0"/>
+          <w:numId w:val="19"/>
+        </w:numPr>
+        <w:spacing w:before="80" w:after="40" w:line="276" w:lineRule="auto"/>
+        <w:jc w:val="both"/>
+        <w:rPr>
+          <w:rFonts w:asciiTheme="minorHAnsi" w:eastAsia="Calibri" w:hAnsiTheme="minorHAnsi" w:cstheme="minorHAnsi"/>
+          <w:i/>
+          <w:iCs/>
+          <w:color w:val="222222"/>
+          <w:sz w:val="19"/>
+          <w:szCs w:val="19"/>
+        </w:rPr>
+      </w:pPr>
+      <w:r>
+        <w:rPr>
+          <w:rFonts w:asciiTheme="minorHAnsi" w:eastAsia="Calibri" w:hAnsiTheme="minorHAnsi" w:cstheme="minorHAnsi"/>
+          <w:b/>
+          <w:bCs/>
+          <w:color w:val="222222"/>
+          <w:sz w:val="19"/>
+          <w:szCs w:val="19"/>
+        </w:rPr>
+        <w:t xml:space="preserve">Laravel Frontend: </w:t>
+      </w:r>
+      <w:r>
+        <w:rPr>
+          <w:rFonts w:asciiTheme="minorHAnsi" w:eastAsia="Calibri" w:hAnsiTheme="minorHAnsi" w:cstheme="minorHAnsi"/>
+          <w:color w:val="222222"/>
+          <w:sz w:val="19"/>
+          <w:szCs w:val="19"/>
+        </w:rPr>
+        <w:t>Delivers an interactive, high-traffic portal built with Blade for mock exam testing, utilizing countdown exam timers, live question-rendering modules, and real-time student performance dashboards.</w:t>
+      </w:r>
+    </w:p>
+    <w:p>
+      <w:pPr>
+        <w:spacing w:before="80" w:after="40" w:line="276" w:lineRule="auto"/>
+        <w:rPr>
+          <w:rFonts w:asciiTheme="minorHAnsi" w:eastAsia="Calibri" w:hAnsiTheme="minorHAnsi" w:cstheme="minorHAnsi"/>
+          <w:i/>
+          <w:iCs/>
+          <w:color w:val="222222"/>
+          <w:sz w:val="19"/>
+          <w:szCs w:val="19"/>
+        </w:rPr>
+      </w:pPr>
+    </w:p>
+    <w:p>
+      <w:pPr>
+        <w:spacing w:before="80" w:after="40" w:line="276" w:lineRule="auto"/>
+        <w:rPr>
+          <w:rFonts w:asciiTheme="minorHAnsi" w:eastAsia="Calibri" w:hAnsiTheme="minorHAnsi" w:cstheme="minorHAnsi"/>
+          <w:i/>
+          <w:iCs/>
+          <w:color w:val="222222"/>
+          <w:sz w:val="19"/>
+          <w:szCs w:val="19"/>
+        </w:rPr>
+      </w:pPr>
+      <w:r>
+        <w:rPr>
+          <w:rFonts w:asciiTheme="minorHAnsi" w:eastAsia="Calibri" w:hAnsiTheme="minorHAnsi" w:cstheme="minorHAnsi"/>
+          <w:b/>
+          <w:bCs/>
+          <w:color w:val="222222"/>
+          <w:sz w:val="19"/>
+          <w:szCs w:val="19"/>
+        </w:rPr>
+        <w:t xml:space="preserve">Ranthamboretigerreserve.in </w:t>
+      </w:r>
+      <w:r>
+        <w:rPr>
+          <w:rFonts w:asciiTheme="minorHAnsi" w:eastAsia="Calibri" w:hAnsiTheme="minorHAnsi" w:cstheme="minorHAnsi"/>
+          <w:color w:val="222222"/>
+          <w:sz w:val="19"/>
+          <w:szCs w:val="19"/>
+        </w:rPr>
+        <w:t>— Website for Safari operator with the Rajasthan Tourism Department (</w:t>
+      </w:r>
+      <w:r>
+        <w:rPr>
+          <w:rFonts w:asciiTheme="minorHAnsi" w:eastAsia="Calibri" w:hAnsiTheme="minorHAnsi" w:cstheme="minorHAnsi"/>
+          <w:i/>
+          <w:iCs/>
+          <w:color w:val="222222"/>
+          <w:sz w:val="19"/>
+          <w:szCs w:val="19"/>
+        </w:rPr>
+        <w:t>Node ·React · MySQL)</w:t>
+      </w:r>
+    </w:p>
+    <w:p>
+      <w:pPr>
+        <w:pStyle w:val="ListParagraph"/>
+        <w:numPr>
+          <w:ilvl w:val="0"/>
+          <w:numId w:val="19"/>
+        </w:numPr>
+        <w:spacing w:before="80" w:after="40" w:line="276" w:lineRule="auto"/>
+        <w:jc w:val="both"/>
+        <w:rPr>
+          <w:rFonts w:asciiTheme="minorHAnsi" w:eastAsia="Calibri" w:hAnsiTheme="minorHAnsi" w:cstheme="minorHAnsi"/>
+          <w:i/>
+          <w:iCs/>
+          <w:color w:val="222222"/>
+          <w:sz w:val="19"/>
+          <w:szCs w:val="19"/>
+        </w:rPr>
+      </w:pPr>
+      <w:r>
+        <w:rPr>
+          <w:rFonts w:asciiTheme="minorHAnsi" w:eastAsia="Calibri" w:hAnsiTheme="minorHAnsi" w:cstheme="minorHAnsi"/>
+          <w:b/>
+          <w:bCs/>
+          <w:color w:val="222222"/>
+          <w:sz w:val="19"/>
+          <w:szCs w:val="19"/>
+        </w:rPr>
+        <w:t>Node.js Backend</w:t>
+      </w:r>
+      <w:r>
+        <w:rPr>
+          <w:rFonts w:asciiTheme="minorHAnsi" w:eastAsia="Calibri" w:hAnsiTheme="minorHAnsi" w:cstheme="minorHAnsi"/>
+          <w:color w:val="222222"/>
+          <w:sz w:val="19"/>
+          <w:szCs w:val="19"/>
+        </w:rPr>
+        <w:t xml:space="preserve">: Engineered a high-concurrency booking engine managing real-time vehicle permit availability (Gypsy/Canter) across 10 safari zones, integrating multi-gateway payment processing and instant automated SMS/email booking confirmations. </w:t>
+      </w:r>
+    </w:p>
+    <w:p>
+      <w:pPr>
+        <w:pStyle w:val="ListParagraph"/>
+        <w:numPr>
+          <w:ilvl w:val="0"/>
+          <w:numId w:val="19"/>
+        </w:numPr>
+        <w:spacing w:before="80" w:after="40" w:line="276" w:lineRule="auto"/>
+        <w:jc w:val="both"/>
+        <w:rPr>
+          <w:rFonts w:asciiTheme="minorHAnsi" w:eastAsia="Calibri" w:hAnsiTheme="minorHAnsi" w:cstheme="minorHAnsi"/>
+          <w:b/>
+          <w:bCs/>
+          <w:color w:val="222222"/>
+          <w:sz w:val="19"/>
+          <w:szCs w:val="19"/>
+        </w:rPr>
+      </w:pPr>
+      <w:r>
+        <w:rPr>
+          <w:rFonts w:asciiTheme="minorHAnsi" w:eastAsia="Calibri" w:hAnsiTheme="minorHAnsi" w:cstheme="minorHAnsi"/>
+          <w:b/>
+          <w:bCs/>
+          <w:color w:val="222222"/>
+          <w:sz w:val="19"/>
+          <w:szCs w:val="19"/>
+        </w:rPr>
+        <w:t>React Frontend</w:t>
+      </w:r>
+      <w:r>
+        <w:rPr>
+          <w:rFonts w:asciiTheme="minorHAnsi" w:eastAsia="Calibri" w:hAnsiTheme="minorHAnsi" w:cstheme="minorHAnsi"/>
+          <w:color w:val="222222"/>
+          <w:sz w:val="19"/>
+          <w:szCs w:val="19"/>
+        </w:rPr>
+        <w:t>: Developed an interactive, dynamic seat-selection dashboard with multi-step checkout forms, responsive tour package configuration panels, and live seasonal notification alerts regarding park closure statuses.</w:t>
+      </w:r>
+    </w:p>
+    <w:p>
+      <w:pPr>
+        <w:pStyle w:val="ListParagraph"/>
+        <w:spacing w:before="80" w:after="40" w:line="276" w:lineRule="auto"/>
+        <w:ind w:left="720"/>
+        <w:jc w:val="both"/>
+        <w:rPr>
+          <w:rFonts w:asciiTheme="minorHAnsi" w:eastAsia="Calibri" w:hAnsiTheme="minorHAnsi" w:cstheme="minorHAnsi"/>
+          <w:b/>
+          <w:bCs/>
+          <w:color w:val="222222"/>
           <w:sz w:val="19"/>
           <w:szCs w:val="19"/>
         </w:rPr>
@@ -1501,13 +1833,12 @@
           <w:sz w:val="19"/>
           <w:szCs w:val="19"/>
         </w:rPr>
-        <w:lastRenderedPageBreak/>
-        <w:t>KEY PROJECTS</w:t>
-      </w:r>
-    </w:p>
-    <w:p>
-      <w:pPr>
-        <w:spacing w:before="80" w:after="40" w:line="276" w:lineRule="auto"/>
+        <w:t>EDUCATION</w:t>
+      </w:r>
+    </w:p>
+    <w:p>
+      <w:pPr>
+        <w:spacing w:after="40" w:line="276" w:lineRule="auto"/>
         <w:rPr>
           <w:rFonts w:asciiTheme="minorHAnsi" w:hAnsiTheme="minorHAnsi" w:cstheme="minorHAnsi"/>
           <w:sz w:val="19"/>
@@ -1523,68 +1854,32 @@
           <w:sz w:val="19"/>
           <w:szCs w:val="19"/>
         </w:rPr>
-        <w:t>Swissvans.com</w:t>
-      </w:r>
-      <w:r>
-        <w:rPr>
-          <w:rFonts w:asciiTheme="minorHAnsi" w:eastAsia="Calibri" w:hAnsiTheme="minorHAnsi" w:cstheme="minorHAnsi"/>
-          <w:color w:val="222222"/>
-          <w:sz w:val="19"/>
-          <w:szCs w:val="19"/>
-        </w:rPr>
-        <w:t xml:space="preserve"> — </w:t>
-      </w:r>
-      <w:r>
-        <w:rPr>
-          <w:rFonts w:asciiTheme="minorHAnsi" w:eastAsia="Calibri" w:hAnsiTheme="minorHAnsi" w:cstheme="minorHAnsi"/>
-          <w:color w:val="222222"/>
-          <w:sz w:val="19"/>
-          <w:szCs w:val="19"/>
-        </w:rPr>
-        <w:t xml:space="preserve">Website for UK Based Van Leasing Company </w:t>
-      </w:r>
-      <w:r>
-        <w:rPr>
-          <w:rFonts w:asciiTheme="minorHAnsi" w:eastAsia="Calibri" w:hAnsiTheme="minorHAnsi" w:cstheme="minorHAnsi"/>
-          <w:i/>
-          <w:iCs/>
-          <w:color w:val="222222"/>
-          <w:sz w:val="19"/>
-          <w:szCs w:val="19"/>
-        </w:rPr>
-        <w:t xml:space="preserve">(Laravel · </w:t>
-      </w:r>
-      <w:r>
-        <w:rPr>
-          <w:rFonts w:asciiTheme="minorHAnsi" w:eastAsia="Calibri" w:hAnsiTheme="minorHAnsi" w:cstheme="minorHAnsi"/>
-          <w:i/>
-          <w:iCs/>
-          <w:color w:val="222222"/>
-          <w:sz w:val="19"/>
-          <w:szCs w:val="19"/>
-        </w:rPr>
-        <w:t>Next.js</w:t>
-      </w:r>
-      <w:r>
-        <w:rPr>
-          <w:rFonts w:asciiTheme="minorHAnsi" w:eastAsia="Calibri" w:hAnsiTheme="minorHAnsi" w:cstheme="minorHAnsi"/>
-          <w:i/>
-          <w:iCs/>
-          <w:color w:val="222222"/>
-          <w:sz w:val="19"/>
-          <w:szCs w:val="19"/>
-        </w:rPr>
-        <w:t xml:space="preserve"> · MySQL · AWS)</w:t>
-      </w:r>
-    </w:p>
-    <w:p>
-      <w:pPr>
-        <w:pStyle w:val="ListParagraph"/>
-        <w:numPr>
-          <w:ilvl w:val="0"/>
-          <w:numId w:val="2"/>
-        </w:numPr>
-        <w:spacing w:after="50" w:line="276" w:lineRule="auto"/>
+        <w:t>Bachelor of Technology — Electrical Engineering</w:t>
+      </w:r>
+    </w:p>
+    <w:p>
+      <w:pPr>
+        <w:spacing w:after="80" w:line="276" w:lineRule="auto"/>
+        <w:rPr>
+          <w:rFonts w:asciiTheme="minorHAnsi" w:eastAsia="Calibri" w:hAnsiTheme="minorHAnsi" w:cstheme="minorHAnsi"/>
+          <w:color w:val="222222"/>
+          <w:sz w:val="19"/>
+          <w:szCs w:val="19"/>
+        </w:rPr>
+      </w:pPr>
+      <w:r>
+        <w:rPr>
+          <w:rFonts w:asciiTheme="minorHAnsi" w:eastAsia="Calibri" w:hAnsiTheme="minorHAnsi" w:cstheme="minorHAnsi"/>
+          <w:color w:val="222222"/>
+          <w:sz w:val="19"/>
+          <w:szCs w:val="19"/>
+        </w:rPr>
+        <w:t>Noida International University · 2012 – 2016</w:t>
+      </w:r>
+    </w:p>
+    <w:p>
+      <w:pPr>
+        <w:spacing w:after="80" w:line="276" w:lineRule="auto"/>
         <w:rPr>
           <w:rFonts w:asciiTheme="minorHAnsi" w:hAnsiTheme="minorHAnsi" w:cstheme="minorHAnsi"/>
           <w:sz w:val="19"/>
@@ -1593,8 +1888,17 @@
       </w:pPr>
       <w:r>
         <w:rPr>
-          <w:rFonts w:asciiTheme="minorHAnsi" w:eastAsia="Calibri" w:hAnsiTheme="minorHAnsi" w:cstheme="minorHAnsi"/>
-          <w:color w:val="222222"/>
+          <w:rFonts w:asciiTheme="minorHAnsi" w:hAnsiTheme="minorHAnsi" w:cstheme="minorHAnsi"/>
+          <w:b/>
+          <w:bCs/>
+          <w:sz w:val="19"/>
+          <w:szCs w:val="19"/>
+        </w:rPr>
+        <w:t>All India Senior School Certificate Examination (CBSE Class XII)</w:t>
+      </w:r>
+      <w:r>
+        <w:rPr>
+          <w:rFonts w:asciiTheme="minorHAnsi" w:hAnsiTheme="minorHAnsi" w:cstheme="minorHAnsi"/>
           <w:sz w:val="19"/>
           <w:szCs w:val="19"/>
         </w:rPr>
@@ -1602,43 +1906,36 @@
       </w:r>
       <w:r>
         <w:rPr>
-          <w:rFonts w:asciiTheme="minorHAnsi" w:eastAsia="Calibri" w:hAnsiTheme="minorHAnsi" w:cstheme="minorHAnsi"/>
-          <w:b/>
-          <w:bCs/>
-          <w:color w:val="222222"/>
-          <w:sz w:val="19"/>
-          <w:szCs w:val="19"/>
-        </w:rPr>
-        <w:t>Laravel Backend:</w:t>
-      </w:r>
-      <w:r>
-        <w:rPr>
-          <w:rFonts w:asciiTheme="minorHAnsi" w:eastAsia="Calibri" w:hAnsiTheme="minorHAnsi" w:cstheme="minorHAnsi"/>
-          <w:color w:val="222222"/>
-          <w:sz w:val="19"/>
-          <w:szCs w:val="19"/>
-        </w:rPr>
-        <w:t xml:space="preserve"> Implements the core REST API handling scheduling, constraints, and triggering real-time WebSocket events via Laravel Reverb/Pusher when shift assignments change.</w:t>
-      </w:r>
-    </w:p>
-    <w:p>
-      <w:pPr>
-        <w:pStyle w:val="ListParagraph"/>
-        <w:numPr>
-          <w:ilvl w:val="0"/>
-          <w:numId w:val="2"/>
-        </w:numPr>
-        <w:spacing w:after="50" w:line="276" w:lineRule="auto"/>
-        <w:rPr>
           <w:rFonts w:asciiTheme="minorHAnsi" w:hAnsiTheme="minorHAnsi" w:cstheme="minorHAnsi"/>
           <w:sz w:val="19"/>
           <w:szCs w:val="19"/>
         </w:rPr>
-      </w:pPr>
-      <w:r>
-        <w:rPr>
-          <w:rFonts w:asciiTheme="minorHAnsi" w:eastAsia="Calibri" w:hAnsiTheme="minorHAnsi" w:cstheme="minorHAnsi"/>
-          <w:color w:val="222222"/>
+        <w:br/>
+        <w:t>Ramjas School No.4, Paharganj, Delhi 110055</w:t>
+      </w:r>
+    </w:p>
+    <w:p>
+      <w:pPr>
+        <w:spacing w:after="80" w:line="276" w:lineRule="auto"/>
+        <w:rPr>
+          <w:rFonts w:asciiTheme="minorHAnsi" w:hAnsiTheme="minorHAnsi" w:cstheme="minorHAnsi"/>
+          <w:sz w:val="19"/>
+          <w:szCs w:val="19"/>
+        </w:rPr>
+      </w:pPr>
+      <w:r>
+        <w:rPr>
+          <w:rFonts w:asciiTheme="minorHAnsi" w:hAnsiTheme="minorHAnsi" w:cstheme="minorHAnsi"/>
+          <w:b/>
+          <w:bCs/>
+          <w:sz w:val="19"/>
+          <w:szCs w:val="19"/>
+        </w:rPr>
+        <w:t>All India Secondary School Examination (CBSE Class X)</w:t>
+      </w:r>
+      <w:r>
+        <w:rPr>
+          <w:rFonts w:asciiTheme="minorHAnsi" w:hAnsiTheme="minorHAnsi" w:cstheme="minorHAnsi"/>
           <w:sz w:val="19"/>
           <w:szCs w:val="19"/>
         </w:rPr>
@@ -1646,770 +1943,33 @@
       </w:r>
       <w:r>
         <w:rPr>
-          <w:rFonts w:asciiTheme="minorHAnsi" w:eastAsia="Calibri" w:hAnsiTheme="minorHAnsi" w:cstheme="minorHAnsi"/>
-          <w:b/>
-          <w:bCs/>
-          <w:color w:val="222222"/>
-          <w:sz w:val="19"/>
-          <w:szCs w:val="19"/>
-        </w:rPr>
-        <w:t>Next.js Frontend:</w:t>
-      </w:r>
-      <w:r>
-        <w:rPr>
-          <w:rFonts w:asciiTheme="minorHAnsi" w:eastAsia="Calibri" w:hAnsiTheme="minorHAnsi" w:cstheme="minorHAnsi"/>
-          <w:color w:val="222222"/>
-          <w:sz w:val="19"/>
-          <w:szCs w:val="19"/>
-        </w:rPr>
-        <w:t xml:space="preserve"> Provides a reactive, state-managed schedule UI that listens to live backend broadcasts to update employee shifts instantly without requiring page refreshes.</w:t>
-      </w:r>
-    </w:p>
-    <w:p>
-      <w:pPr>
-        <w:pStyle w:val="ListParagraph"/>
-        <w:spacing w:after="50" w:line="276" w:lineRule="auto"/>
-        <w:ind w:left="480"/>
-        <w:rPr>
           <w:rFonts w:asciiTheme="minorHAnsi" w:hAnsiTheme="minorHAnsi" w:cstheme="minorHAnsi"/>
           <w:sz w:val="19"/>
           <w:szCs w:val="19"/>
         </w:rPr>
-      </w:pPr>
-    </w:p>
-    <w:p>
-      <w:pPr>
-        <w:spacing w:before="80" w:after="40" w:line="276" w:lineRule="auto"/>
-        <w:rPr>
-          <w:rFonts w:asciiTheme="minorHAnsi" w:eastAsia="Calibri" w:hAnsiTheme="minorHAnsi" w:cstheme="minorHAnsi"/>
-          <w:color w:val="222222"/>
-          <w:sz w:val="19"/>
-          <w:szCs w:val="19"/>
-        </w:rPr>
-      </w:pPr>
-      <w:r>
-        <w:rPr>
-          <w:rFonts w:asciiTheme="minorHAnsi" w:eastAsia="Calibri" w:hAnsiTheme="minorHAnsi" w:cstheme="minorHAnsi"/>
-          <w:b/>
-          <w:bCs/>
-          <w:color w:val="222222"/>
-          <w:sz w:val="19"/>
-          <w:szCs w:val="19"/>
-        </w:rPr>
-        <w:t xml:space="preserve">Trostaparkering.se </w:t>
-      </w:r>
-      <w:r>
-        <w:rPr>
-          <w:rFonts w:asciiTheme="minorHAnsi" w:eastAsia="Calibri" w:hAnsiTheme="minorHAnsi" w:cstheme="minorHAnsi"/>
-          <w:color w:val="222222"/>
-          <w:sz w:val="19"/>
-          <w:szCs w:val="19"/>
-        </w:rPr>
-        <w:t>— Website</w:t>
-      </w:r>
-      <w:r>
-        <w:rPr>
-          <w:rFonts w:asciiTheme="minorHAnsi" w:eastAsia="Calibri" w:hAnsiTheme="minorHAnsi" w:cstheme="minorHAnsi"/>
-          <w:color w:val="222222"/>
-          <w:sz w:val="19"/>
-          <w:szCs w:val="19"/>
-        </w:rPr>
-        <w:t xml:space="preserve"> for </w:t>
-      </w:r>
-      <w:r>
-        <w:rPr>
-          <w:rFonts w:asciiTheme="minorHAnsi" w:eastAsia="Calibri" w:hAnsiTheme="minorHAnsi" w:cstheme="minorHAnsi"/>
-          <w:color w:val="222222"/>
-          <w:sz w:val="19"/>
-          <w:szCs w:val="19"/>
-        </w:rPr>
-        <w:t>Sweden</w:t>
-      </w:r>
-      <w:r>
-        <w:rPr>
-          <w:rFonts w:asciiTheme="minorHAnsi" w:eastAsia="Calibri" w:hAnsiTheme="minorHAnsi" w:cstheme="minorHAnsi"/>
-          <w:color w:val="222222"/>
-          <w:sz w:val="19"/>
-          <w:szCs w:val="19"/>
-        </w:rPr>
-        <w:t xml:space="preserve"> Based </w:t>
-      </w:r>
-      <w:r>
-        <w:rPr>
-          <w:rFonts w:asciiTheme="minorHAnsi" w:eastAsia="Calibri" w:hAnsiTheme="minorHAnsi" w:cstheme="minorHAnsi"/>
-          <w:color w:val="222222"/>
-          <w:sz w:val="19"/>
-          <w:szCs w:val="19"/>
-        </w:rPr>
-        <w:t xml:space="preserve">Parking </w:t>
-      </w:r>
-      <w:r>
-        <w:rPr>
-          <w:rFonts w:asciiTheme="minorHAnsi" w:eastAsia="Calibri" w:hAnsiTheme="minorHAnsi" w:cstheme="minorHAnsi"/>
-          <w:color w:val="222222"/>
-          <w:sz w:val="19"/>
-          <w:szCs w:val="19"/>
-        </w:rPr>
-        <w:t xml:space="preserve">Company </w:t>
-      </w:r>
-      <w:r>
-        <w:rPr>
-          <w:rFonts w:asciiTheme="minorHAnsi" w:eastAsia="Calibri" w:hAnsiTheme="minorHAnsi" w:cstheme="minorHAnsi"/>
-          <w:i/>
-          <w:iCs/>
-          <w:color w:val="222222"/>
-          <w:sz w:val="19"/>
-          <w:szCs w:val="19"/>
-        </w:rPr>
-        <w:t>(Laravel · Next.js · MySQL · AWS)</w:t>
-      </w:r>
-    </w:p>
-    <w:p>
-      <w:pPr>
-        <w:pStyle w:val="ListParagraph"/>
-        <w:numPr>
-          <w:ilvl w:val="0"/>
-          <w:numId w:val="3"/>
-        </w:numPr>
-        <w:spacing w:before="80" w:after="40" w:line="276" w:lineRule="auto"/>
+        <w:br/>
+        <w:t>AG DAV Centenary Public School, Model Town, Delhi 110009</w:t>
+      </w:r>
+    </w:p>
+    <w:p>
+      <w:pPr>
+        <w:spacing w:after="80" w:line="276" w:lineRule="auto"/>
         <w:rPr>
           <w:rFonts w:asciiTheme="minorHAnsi" w:hAnsiTheme="minorHAnsi" w:cstheme="minorHAnsi"/>
           <w:sz w:val="19"/>
           <w:szCs w:val="19"/>
         </w:rPr>
       </w:pPr>
-      <w:r>
-        <w:rPr>
-          <w:rFonts w:asciiTheme="minorHAnsi" w:eastAsia="Calibri" w:hAnsiTheme="minorHAnsi" w:cstheme="minorHAnsi"/>
-          <w:b/>
-          <w:bCs/>
-          <w:color w:val="222222"/>
-          <w:sz w:val="19"/>
-          <w:szCs w:val="19"/>
-        </w:rPr>
-        <w:t>Laravel Backend:</w:t>
-      </w:r>
-      <w:r>
-        <w:rPr>
-          <w:rFonts w:asciiTheme="minorHAnsi" w:eastAsia="Calibri" w:hAnsiTheme="minorHAnsi" w:cstheme="minorHAnsi"/>
-          <w:color w:val="222222"/>
-          <w:sz w:val="19"/>
-          <w:szCs w:val="19"/>
-        </w:rPr>
-        <w:t xml:space="preserve"> Powers a performance-optimized, multilingual API driving localized content routing, while executing a high-throughput data pipeline that scrapes, parses PDFs, and normalizes 50k+ parking SKUs for Excel export.</w:t>
-      </w:r>
-    </w:p>
-    <w:p>
-      <w:pPr>
-        <w:pStyle w:val="ListParagraph"/>
-        <w:numPr>
-          <w:ilvl w:val="0"/>
-          <w:numId w:val="3"/>
-        </w:numPr>
-        <w:spacing w:before="80" w:after="40" w:line="276" w:lineRule="auto"/>
+    </w:p>
+    <w:p>
+      <w:pPr>
+        <w:spacing w:after="80" w:line="276" w:lineRule="auto"/>
         <w:rPr>
           <w:rFonts w:asciiTheme="minorHAnsi" w:hAnsiTheme="minorHAnsi" w:cstheme="minorHAnsi"/>
           <w:sz w:val="19"/>
           <w:szCs w:val="19"/>
         </w:rPr>
       </w:pPr>
-      <w:r>
-        <w:rPr>
-          <w:rFonts w:asciiTheme="minorHAnsi" w:hAnsiTheme="minorHAnsi" w:cstheme="minorHAnsi"/>
-          <w:b/>
-          <w:bCs/>
-          <w:sz w:val="19"/>
-          <w:szCs w:val="19"/>
-        </w:rPr>
-        <w:t>Next.js Frontend:</w:t>
-      </w:r>
-      <w:r>
-        <w:rPr>
-          <w:rFonts w:asciiTheme="minorHAnsi" w:hAnsiTheme="minorHAnsi" w:cstheme="minorHAnsi"/>
-          <w:sz w:val="19"/>
-          <w:szCs w:val="19"/>
-        </w:rPr>
-        <w:t xml:space="preserve"> Delivers a blazing-fast, SEO-optimized multilingual user experience across Sweden, leveraging advanced caching, server-side localized rendering (SSR), and smooth static generation to handle high-traffic parkers efficiently.</w:t>
-      </w:r>
-    </w:p>
-    <w:p>
-      <w:pPr>
-        <w:pStyle w:val="ListParagraph"/>
-        <w:spacing w:before="80" w:after="40" w:line="276" w:lineRule="auto"/>
-        <w:ind w:left="720"/>
-        <w:rPr>
-          <w:rFonts w:asciiTheme="minorHAnsi" w:hAnsiTheme="minorHAnsi" w:cstheme="minorHAnsi"/>
-          <w:sz w:val="19"/>
-          <w:szCs w:val="19"/>
-        </w:rPr>
-      </w:pPr>
-    </w:p>
-    <w:p>
-      <w:pPr>
-        <w:spacing w:before="80" w:after="40" w:line="276" w:lineRule="auto"/>
-        <w:rPr>
-          <w:rFonts w:asciiTheme="minorHAnsi" w:hAnsiTheme="minorHAnsi" w:cstheme="minorHAnsi"/>
-          <w:sz w:val="19"/>
-          <w:szCs w:val="19"/>
-        </w:rPr>
-      </w:pPr>
-      <w:r>
-        <w:rPr>
-          <w:rFonts w:asciiTheme="minorHAnsi" w:eastAsia="Calibri" w:hAnsiTheme="minorHAnsi" w:cstheme="minorHAnsi"/>
-          <w:b/>
-          <w:bCs/>
-          <w:color w:val="222222"/>
-          <w:sz w:val="19"/>
-          <w:szCs w:val="19"/>
-        </w:rPr>
-        <w:t>Mosaiekexpo</w:t>
-      </w:r>
-      <w:r>
-        <w:rPr>
-          <w:rFonts w:asciiTheme="minorHAnsi" w:eastAsia="Calibri" w:hAnsiTheme="minorHAnsi" w:cstheme="minorHAnsi"/>
-          <w:b/>
-          <w:bCs/>
-          <w:color w:val="222222"/>
-          <w:sz w:val="19"/>
-          <w:szCs w:val="19"/>
-        </w:rPr>
-        <w:t>.co.za</w:t>
-      </w:r>
-      <w:r>
-        <w:rPr>
-          <w:rFonts w:asciiTheme="minorHAnsi" w:eastAsia="Calibri" w:hAnsiTheme="minorHAnsi" w:cstheme="minorHAnsi"/>
-          <w:b/>
-          <w:bCs/>
-          <w:color w:val="222222"/>
-          <w:sz w:val="19"/>
-          <w:szCs w:val="19"/>
-        </w:rPr>
-        <w:t xml:space="preserve"> </w:t>
-      </w:r>
-      <w:r>
-        <w:rPr>
-          <w:rFonts w:asciiTheme="minorHAnsi" w:eastAsia="Calibri" w:hAnsiTheme="minorHAnsi" w:cstheme="minorHAnsi"/>
-          <w:color w:val="222222"/>
-          <w:sz w:val="19"/>
-          <w:szCs w:val="19"/>
-        </w:rPr>
-        <w:t>— POS</w:t>
-      </w:r>
-      <w:r>
-        <w:rPr>
-          <w:rFonts w:asciiTheme="minorHAnsi" w:eastAsia="Calibri" w:hAnsiTheme="minorHAnsi" w:cstheme="minorHAnsi"/>
-          <w:color w:val="222222"/>
-          <w:sz w:val="19"/>
-          <w:szCs w:val="19"/>
-        </w:rPr>
-        <w:t xml:space="preserve"> Management SaaS for</w:t>
-      </w:r>
-      <w:r>
-        <w:rPr>
-          <w:rFonts w:asciiTheme="minorHAnsi" w:eastAsia="Calibri" w:hAnsiTheme="minorHAnsi" w:cstheme="minorHAnsi"/>
-          <w:color w:val="222222"/>
-          <w:sz w:val="19"/>
-          <w:szCs w:val="19"/>
-        </w:rPr>
-        <w:t xml:space="preserve"> South Africa based</w:t>
-      </w:r>
-      <w:r>
-        <w:rPr>
-          <w:rFonts w:asciiTheme="minorHAnsi" w:eastAsia="Calibri" w:hAnsiTheme="minorHAnsi" w:cstheme="minorHAnsi"/>
-          <w:color w:val="222222"/>
-          <w:sz w:val="19"/>
-          <w:szCs w:val="19"/>
-        </w:rPr>
-        <w:t xml:space="preserve"> </w:t>
-      </w:r>
-      <w:r>
-        <w:rPr>
-          <w:rFonts w:asciiTheme="minorHAnsi" w:eastAsia="Calibri" w:hAnsiTheme="minorHAnsi" w:cstheme="minorHAnsi"/>
-          <w:color w:val="222222"/>
-          <w:sz w:val="19"/>
-          <w:szCs w:val="19"/>
-        </w:rPr>
-        <w:t>Exhibitions (</w:t>
-      </w:r>
-      <w:r>
-        <w:rPr>
-          <w:rFonts w:asciiTheme="minorHAnsi" w:eastAsia="Calibri" w:hAnsiTheme="minorHAnsi" w:cstheme="minorHAnsi"/>
-          <w:i/>
-          <w:iCs/>
-          <w:color w:val="222222"/>
-          <w:sz w:val="19"/>
-          <w:szCs w:val="19"/>
-        </w:rPr>
-        <w:t xml:space="preserve">Laravel · </w:t>
-      </w:r>
-      <w:r>
-        <w:rPr>
-          <w:rFonts w:asciiTheme="minorHAnsi" w:eastAsia="Calibri" w:hAnsiTheme="minorHAnsi" w:cstheme="minorHAnsi"/>
-          <w:i/>
-          <w:iCs/>
-          <w:color w:val="222222"/>
-          <w:sz w:val="19"/>
-          <w:szCs w:val="19"/>
-        </w:rPr>
-        <w:t>Blade</w:t>
-      </w:r>
-      <w:r>
-        <w:rPr>
-          <w:rFonts w:asciiTheme="minorHAnsi" w:eastAsia="Calibri" w:hAnsiTheme="minorHAnsi" w:cstheme="minorHAnsi"/>
-          <w:i/>
-          <w:iCs/>
-          <w:color w:val="222222"/>
-          <w:sz w:val="19"/>
-          <w:szCs w:val="19"/>
-        </w:rPr>
-        <w:t xml:space="preserve"> · MySQL)</w:t>
-      </w:r>
-    </w:p>
-    <w:p>
-      <w:pPr>
-        <w:pStyle w:val="ListParagraph"/>
-        <w:numPr>
-          <w:ilvl w:val="0"/>
-          <w:numId w:val="2"/>
-        </w:numPr>
-        <w:spacing w:before="80" w:after="40" w:line="276" w:lineRule="auto"/>
-        <w:rPr>
-          <w:rFonts w:asciiTheme="minorHAnsi" w:eastAsia="Calibri" w:hAnsiTheme="minorHAnsi" w:cstheme="minorHAnsi"/>
-          <w:color w:val="222222"/>
-          <w:sz w:val="19"/>
-          <w:szCs w:val="19"/>
-        </w:rPr>
-      </w:pPr>
-      <w:r>
-        <w:rPr>
-          <w:rFonts w:asciiTheme="minorHAnsi" w:eastAsia="Calibri" w:hAnsiTheme="minorHAnsi" w:cstheme="minorHAnsi"/>
-          <w:b/>
-          <w:bCs/>
-          <w:color w:val="222222"/>
-          <w:sz w:val="19"/>
-          <w:szCs w:val="19"/>
-        </w:rPr>
-        <w:t>Laravel Backend:</w:t>
-      </w:r>
-      <w:r>
-        <w:rPr>
-          <w:rFonts w:asciiTheme="minorHAnsi" w:eastAsia="Calibri" w:hAnsiTheme="minorHAnsi" w:cstheme="minorHAnsi"/>
-          <w:color w:val="222222"/>
-          <w:sz w:val="19"/>
-          <w:szCs w:val="19"/>
-        </w:rPr>
-        <w:t xml:space="preserve"> Powers a performance-optimized system driving automated exhibitor onboarding, digital screening workflows, and a real-time data sync engine that integrates Lightspeed Retail APIs to seamlessly harmonize sales, custom product </w:t>
-      </w:r>
-      <w:r>
-        <w:rPr>
-          <w:rFonts w:asciiTheme="minorHAnsi" w:eastAsia="Calibri" w:hAnsiTheme="minorHAnsi" w:cstheme="minorHAnsi"/>
-          <w:color w:val="222222"/>
-          <w:sz w:val="19"/>
-          <w:szCs w:val="19"/>
-        </w:rPr>
-        <w:t>labelling</w:t>
-      </w:r>
-      <w:r>
-        <w:rPr>
-          <w:rFonts w:asciiTheme="minorHAnsi" w:eastAsia="Calibri" w:hAnsiTheme="minorHAnsi" w:cstheme="minorHAnsi"/>
-          <w:color w:val="222222"/>
-          <w:sz w:val="19"/>
-          <w:szCs w:val="19"/>
-        </w:rPr>
-        <w:t xml:space="preserve">, and SKU inventories. </w:t>
-      </w:r>
-    </w:p>
-    <w:p>
-      <w:pPr>
-        <w:pStyle w:val="ListParagraph"/>
-        <w:numPr>
-          <w:ilvl w:val="0"/>
-          <w:numId w:val="2"/>
-        </w:numPr>
-        <w:spacing w:before="80" w:after="40" w:line="276" w:lineRule="auto"/>
-        <w:rPr>
-          <w:rFonts w:asciiTheme="minorHAnsi" w:hAnsiTheme="minorHAnsi" w:cstheme="minorHAnsi"/>
-          <w:sz w:val="19"/>
-          <w:szCs w:val="19"/>
-        </w:rPr>
-      </w:pPr>
-      <w:r>
-        <w:rPr>
-          <w:rFonts w:asciiTheme="minorHAnsi" w:eastAsia="Calibri" w:hAnsiTheme="minorHAnsi" w:cstheme="minorHAnsi"/>
-          <w:b/>
-          <w:bCs/>
-          <w:color w:val="222222"/>
-          <w:sz w:val="19"/>
-          <w:szCs w:val="19"/>
-        </w:rPr>
-        <w:t>Laravel Frontend:</w:t>
-      </w:r>
-      <w:r>
-        <w:rPr>
-          <w:rFonts w:asciiTheme="minorHAnsi" w:eastAsia="Calibri" w:hAnsiTheme="minorHAnsi" w:cstheme="minorHAnsi"/>
-          <w:color w:val="222222"/>
-          <w:sz w:val="19"/>
-          <w:szCs w:val="19"/>
-        </w:rPr>
-        <w:t xml:space="preserve"> Delivers a lightning-fast, high-traffic user experience built with Blade, optimizing page load speeds and registration workflows for hundreds of participating exhibitors and thousands of expo visitors.</w:t>
-      </w:r>
-    </w:p>
-    <w:p>
-      <w:pPr>
-        <w:spacing w:before="80" w:after="40" w:line="276" w:lineRule="auto"/>
-        <w:rPr>
-          <w:rFonts w:asciiTheme="minorHAnsi" w:eastAsia="Calibri" w:hAnsiTheme="minorHAnsi" w:cstheme="minorHAnsi"/>
-          <w:b/>
-          <w:bCs/>
-          <w:color w:val="222222"/>
-          <w:sz w:val="19"/>
-          <w:szCs w:val="19"/>
-        </w:rPr>
-      </w:pPr>
-    </w:p>
-    <w:p>
-      <w:pPr>
-        <w:spacing w:before="80" w:after="40" w:line="276" w:lineRule="auto"/>
-        <w:rPr>
-          <w:rFonts w:asciiTheme="minorHAnsi" w:eastAsia="Calibri" w:hAnsiTheme="minorHAnsi" w:cstheme="minorHAnsi"/>
-          <w:i/>
-          <w:iCs/>
-          <w:color w:val="222222"/>
-          <w:sz w:val="19"/>
-          <w:szCs w:val="19"/>
-        </w:rPr>
-      </w:pPr>
-      <w:r>
-        <w:rPr>
-          <w:rFonts w:asciiTheme="minorHAnsi" w:eastAsia="Calibri" w:hAnsiTheme="minorHAnsi" w:cstheme="minorHAnsi"/>
-          <w:b/>
-          <w:bCs/>
-          <w:color w:val="222222"/>
-          <w:sz w:val="19"/>
-          <w:szCs w:val="19"/>
-        </w:rPr>
-        <w:t xml:space="preserve">Greattutors.net </w:t>
-      </w:r>
-      <w:r>
-        <w:rPr>
-          <w:rFonts w:asciiTheme="minorHAnsi" w:eastAsia="Calibri" w:hAnsiTheme="minorHAnsi" w:cstheme="minorHAnsi"/>
-          <w:color w:val="222222"/>
-          <w:sz w:val="19"/>
-          <w:szCs w:val="19"/>
-        </w:rPr>
-        <w:t>—</w:t>
-      </w:r>
-      <w:r>
-        <w:rPr>
-          <w:rFonts w:asciiTheme="minorHAnsi" w:eastAsia="Calibri" w:hAnsiTheme="minorHAnsi" w:cstheme="minorHAnsi"/>
-          <w:color w:val="222222"/>
-          <w:sz w:val="19"/>
-          <w:szCs w:val="19"/>
-        </w:rPr>
-        <w:t xml:space="preserve"> A LMS (Learning Management System) for London-based tuition </w:t>
-      </w:r>
-      <w:r>
-        <w:rPr>
-          <w:rFonts w:asciiTheme="minorHAnsi" w:eastAsia="Calibri" w:hAnsiTheme="minorHAnsi" w:cstheme="minorHAnsi"/>
-          <w:color w:val="222222"/>
-          <w:sz w:val="19"/>
-          <w:szCs w:val="19"/>
-        </w:rPr>
-        <w:t>centre (</w:t>
-      </w:r>
-      <w:r>
-        <w:rPr>
-          <w:rFonts w:asciiTheme="minorHAnsi" w:eastAsia="Calibri" w:hAnsiTheme="minorHAnsi" w:cstheme="minorHAnsi"/>
-          <w:i/>
-          <w:iCs/>
-          <w:color w:val="222222"/>
-          <w:sz w:val="19"/>
-          <w:szCs w:val="19"/>
-        </w:rPr>
-        <w:t>Laravel · jQuery · MySQL)</w:t>
-      </w:r>
-    </w:p>
-    <w:p>
-      <w:pPr>
-        <w:pStyle w:val="ListParagraph"/>
-        <w:numPr>
-          <w:ilvl w:val="0"/>
-          <w:numId w:val="6"/>
-        </w:numPr>
-        <w:spacing w:before="80" w:after="40" w:line="276" w:lineRule="auto"/>
-        <w:rPr>
-          <w:rFonts w:asciiTheme="minorHAnsi" w:eastAsia="Calibri" w:hAnsiTheme="minorHAnsi" w:cstheme="minorHAnsi"/>
-          <w:i/>
-          <w:iCs/>
-          <w:color w:val="222222"/>
-          <w:sz w:val="19"/>
-          <w:szCs w:val="19"/>
-        </w:rPr>
-      </w:pPr>
-      <w:r>
-        <w:rPr>
-          <w:rFonts w:asciiTheme="minorHAnsi" w:eastAsia="Calibri" w:hAnsiTheme="minorHAnsi" w:cstheme="minorHAnsi"/>
-          <w:b/>
-          <w:bCs/>
-          <w:color w:val="222222"/>
-          <w:sz w:val="19"/>
-          <w:szCs w:val="19"/>
-        </w:rPr>
-        <w:t xml:space="preserve">Laravel Backend: </w:t>
-      </w:r>
-      <w:r>
-        <w:rPr>
-          <w:rFonts w:asciiTheme="minorHAnsi" w:eastAsia="Calibri" w:hAnsiTheme="minorHAnsi" w:cstheme="minorHAnsi"/>
-          <w:color w:val="222222"/>
-          <w:sz w:val="19"/>
-          <w:szCs w:val="19"/>
-        </w:rPr>
-        <w:t xml:space="preserve">Powers a robust learning management system handling automated homework workflows, recorded video streaming pipelines, and a custom e-commerce engine that dynamically builds personalized exam test papers. </w:t>
-      </w:r>
-    </w:p>
-    <w:p>
-      <w:pPr>
-        <w:pStyle w:val="ListParagraph"/>
-        <w:numPr>
-          <w:ilvl w:val="0"/>
-          <w:numId w:val="6"/>
-        </w:numPr>
-        <w:spacing w:before="80" w:after="40" w:line="276" w:lineRule="auto"/>
-        <w:rPr>
-          <w:rFonts w:asciiTheme="minorHAnsi" w:eastAsia="Calibri" w:hAnsiTheme="minorHAnsi" w:cstheme="minorHAnsi"/>
-          <w:i/>
-          <w:iCs/>
-          <w:color w:val="222222"/>
-          <w:sz w:val="19"/>
-          <w:szCs w:val="19"/>
-        </w:rPr>
-      </w:pPr>
-      <w:r>
-        <w:rPr>
-          <w:rFonts w:asciiTheme="minorHAnsi" w:eastAsia="Calibri" w:hAnsiTheme="minorHAnsi" w:cstheme="minorHAnsi"/>
-          <w:b/>
-          <w:bCs/>
-          <w:color w:val="222222"/>
-          <w:sz w:val="19"/>
-          <w:szCs w:val="19"/>
-        </w:rPr>
-        <w:t xml:space="preserve">Laravel Frontend: </w:t>
-      </w:r>
-      <w:r>
-        <w:rPr>
-          <w:rFonts w:asciiTheme="minorHAnsi" w:eastAsia="Calibri" w:hAnsiTheme="minorHAnsi" w:cstheme="minorHAnsi"/>
-          <w:color w:val="222222"/>
-          <w:sz w:val="19"/>
-          <w:szCs w:val="19"/>
-        </w:rPr>
-        <w:t>Delivers an interactive, high-traffic portal built with Blade for mock exam testing, utilizing countdown exam timers, live question-rendering modules, and real-time student performance dashboards.</w:t>
-      </w:r>
-    </w:p>
-    <w:p>
-      <w:pPr>
-        <w:spacing w:before="80" w:after="40" w:line="276" w:lineRule="auto"/>
-        <w:rPr>
-          <w:rFonts w:asciiTheme="minorHAnsi" w:eastAsia="Calibri" w:hAnsiTheme="minorHAnsi" w:cstheme="minorHAnsi"/>
-          <w:i/>
-          <w:iCs/>
-          <w:color w:val="222222"/>
-          <w:sz w:val="19"/>
-          <w:szCs w:val="19"/>
-        </w:rPr>
-      </w:pPr>
-    </w:p>
-    <w:p>
-      <w:pPr>
-        <w:spacing w:before="80" w:after="40" w:line="276" w:lineRule="auto"/>
-        <w:rPr>
-          <w:rFonts w:asciiTheme="minorHAnsi" w:eastAsia="Calibri" w:hAnsiTheme="minorHAnsi" w:cstheme="minorHAnsi"/>
-          <w:i/>
-          <w:iCs/>
-          <w:color w:val="222222"/>
-          <w:sz w:val="19"/>
-          <w:szCs w:val="19"/>
-        </w:rPr>
-      </w:pPr>
-      <w:r>
-        <w:rPr>
-          <w:rFonts w:asciiTheme="minorHAnsi" w:eastAsia="Calibri" w:hAnsiTheme="minorHAnsi" w:cstheme="minorHAnsi"/>
-          <w:b/>
-          <w:bCs/>
-          <w:color w:val="222222"/>
-          <w:sz w:val="19"/>
-          <w:szCs w:val="19"/>
-        </w:rPr>
-        <w:t>Ranthamboretigerreserve</w:t>
-      </w:r>
-      <w:r>
-        <w:rPr>
-          <w:rFonts w:asciiTheme="minorHAnsi" w:eastAsia="Calibri" w:hAnsiTheme="minorHAnsi" w:cstheme="minorHAnsi"/>
-          <w:b/>
-          <w:bCs/>
-          <w:color w:val="222222"/>
-          <w:sz w:val="19"/>
-          <w:szCs w:val="19"/>
-        </w:rPr>
-        <w:t>.in</w:t>
-      </w:r>
-      <w:r>
-        <w:rPr>
-          <w:rFonts w:asciiTheme="minorHAnsi" w:eastAsia="Calibri" w:hAnsiTheme="minorHAnsi" w:cstheme="minorHAnsi"/>
-          <w:b/>
-          <w:bCs/>
-          <w:color w:val="222222"/>
-          <w:sz w:val="19"/>
-          <w:szCs w:val="19"/>
-        </w:rPr>
-        <w:t xml:space="preserve"> </w:t>
-      </w:r>
-      <w:r>
-        <w:rPr>
-          <w:rFonts w:asciiTheme="minorHAnsi" w:eastAsia="Calibri" w:hAnsiTheme="minorHAnsi" w:cstheme="minorHAnsi"/>
-          <w:color w:val="222222"/>
-          <w:sz w:val="19"/>
-          <w:szCs w:val="19"/>
-        </w:rPr>
-        <w:t xml:space="preserve">— </w:t>
-      </w:r>
-      <w:r>
-        <w:rPr>
-          <w:rFonts w:asciiTheme="minorHAnsi" w:eastAsia="Calibri" w:hAnsiTheme="minorHAnsi" w:cstheme="minorHAnsi"/>
-          <w:color w:val="222222"/>
-          <w:sz w:val="19"/>
-          <w:szCs w:val="19"/>
-        </w:rPr>
-        <w:t xml:space="preserve">Website for Safari operator with the Rajasthan Tourism Department </w:t>
-      </w:r>
-      <w:r>
-        <w:rPr>
-          <w:rFonts w:asciiTheme="minorHAnsi" w:eastAsia="Calibri" w:hAnsiTheme="minorHAnsi" w:cstheme="minorHAnsi"/>
-          <w:color w:val="222222"/>
-          <w:sz w:val="19"/>
-          <w:szCs w:val="19"/>
-        </w:rPr>
-        <w:t>(</w:t>
-      </w:r>
-      <w:r>
-        <w:rPr>
-          <w:rFonts w:asciiTheme="minorHAnsi" w:eastAsia="Calibri" w:hAnsiTheme="minorHAnsi" w:cstheme="minorHAnsi"/>
-          <w:i/>
-          <w:iCs/>
-          <w:color w:val="222222"/>
-          <w:sz w:val="19"/>
-          <w:szCs w:val="19"/>
-        </w:rPr>
-        <w:t>Node</w:t>
-      </w:r>
-      <w:r>
-        <w:rPr>
-          <w:rFonts w:asciiTheme="minorHAnsi" w:eastAsia="Calibri" w:hAnsiTheme="minorHAnsi" w:cstheme="minorHAnsi"/>
-          <w:i/>
-          <w:iCs/>
-          <w:color w:val="222222"/>
-          <w:sz w:val="19"/>
-          <w:szCs w:val="19"/>
-        </w:rPr>
-        <w:t xml:space="preserve"> ·</w:t>
-      </w:r>
-      <w:r>
-        <w:rPr>
-          <w:rFonts w:asciiTheme="minorHAnsi" w:eastAsia="Calibri" w:hAnsiTheme="minorHAnsi" w:cstheme="minorHAnsi"/>
-          <w:i/>
-          <w:iCs/>
-          <w:color w:val="222222"/>
-          <w:sz w:val="19"/>
-          <w:szCs w:val="19"/>
-        </w:rPr>
-        <w:t>React</w:t>
-      </w:r>
-      <w:r>
-        <w:rPr>
-          <w:rFonts w:asciiTheme="minorHAnsi" w:eastAsia="Calibri" w:hAnsiTheme="minorHAnsi" w:cstheme="minorHAnsi"/>
-          <w:i/>
-          <w:iCs/>
-          <w:color w:val="222222"/>
-          <w:sz w:val="19"/>
-          <w:szCs w:val="19"/>
-        </w:rPr>
-        <w:t xml:space="preserve"> · MySQL)</w:t>
-      </w:r>
-    </w:p>
-    <w:p>
-      <w:pPr>
-        <w:pStyle w:val="ListParagraph"/>
-        <w:numPr>
-          <w:ilvl w:val="0"/>
-          <w:numId w:val="7"/>
-        </w:numPr>
-        <w:spacing w:before="80" w:after="40" w:line="276" w:lineRule="auto"/>
-        <w:rPr>
-          <w:rFonts w:asciiTheme="minorHAnsi" w:eastAsia="Calibri" w:hAnsiTheme="minorHAnsi" w:cstheme="minorHAnsi"/>
-          <w:i/>
-          <w:iCs/>
-          <w:color w:val="222222"/>
-          <w:sz w:val="19"/>
-          <w:szCs w:val="19"/>
-        </w:rPr>
-      </w:pPr>
-      <w:r>
-        <w:rPr>
-          <w:rFonts w:asciiTheme="minorHAnsi" w:eastAsia="Calibri" w:hAnsiTheme="minorHAnsi" w:cstheme="minorHAnsi"/>
-          <w:b/>
-          <w:bCs/>
-          <w:color w:val="222222"/>
-          <w:sz w:val="19"/>
-          <w:szCs w:val="19"/>
-        </w:rPr>
-        <w:t>Node.js Backend</w:t>
-      </w:r>
-      <w:r>
-        <w:rPr>
-          <w:rFonts w:asciiTheme="minorHAnsi" w:eastAsia="Calibri" w:hAnsiTheme="minorHAnsi" w:cstheme="minorHAnsi"/>
-          <w:color w:val="222222"/>
-          <w:sz w:val="19"/>
-          <w:szCs w:val="19"/>
-        </w:rPr>
-        <w:t xml:space="preserve">: Engineered a high-concurrency booking engine managing real-time vehicle permit availability (Gypsy/Canter) across 10 safari zones, integrating multi-gateway payment processing and instant automated SMS/email booking confirmations. </w:t>
-      </w:r>
-    </w:p>
-    <w:p>
-      <w:pPr>
-        <w:pStyle w:val="ListParagraph"/>
-        <w:numPr>
-          <w:ilvl w:val="0"/>
-          <w:numId w:val="7"/>
-        </w:numPr>
-        <w:spacing w:before="80" w:after="40" w:line="276" w:lineRule="auto"/>
-        <w:rPr>
-          <w:rFonts w:asciiTheme="minorHAnsi" w:eastAsia="Calibri" w:hAnsiTheme="minorHAnsi" w:cstheme="minorHAnsi"/>
-          <w:b/>
-          <w:bCs/>
-          <w:color w:val="222222"/>
-          <w:sz w:val="19"/>
-          <w:szCs w:val="19"/>
-        </w:rPr>
-      </w:pPr>
-      <w:r>
-        <w:rPr>
-          <w:rFonts w:asciiTheme="minorHAnsi" w:eastAsia="Calibri" w:hAnsiTheme="minorHAnsi" w:cstheme="minorHAnsi"/>
-          <w:b/>
-          <w:bCs/>
-          <w:color w:val="222222"/>
-          <w:sz w:val="19"/>
-          <w:szCs w:val="19"/>
-        </w:rPr>
-        <w:t>React Frontend</w:t>
-      </w:r>
-      <w:r>
-        <w:rPr>
-          <w:rFonts w:asciiTheme="minorHAnsi" w:eastAsia="Calibri" w:hAnsiTheme="minorHAnsi" w:cstheme="minorHAnsi"/>
-          <w:color w:val="222222"/>
-          <w:sz w:val="19"/>
-          <w:szCs w:val="19"/>
-        </w:rPr>
-        <w:t>: Developed an interactive, dynamic seat-selection dashboard with multi-step checkout forms, responsive tour package configuration panels, and live seasonal notification alerts regarding park closure statuses.</w:t>
-      </w:r>
     </w:p>
     <w:p>
       <w:pPr>
@@ -2432,211 +1992,60 @@
           <w:sz w:val="19"/>
           <w:szCs w:val="19"/>
         </w:rPr>
-        <w:t>EDUCATION</w:t>
+        <w:lastRenderedPageBreak/>
+        <w:t>CERTIFICATIONS</w:t>
       </w:r>
     </w:p>
     <w:p>
       <w:pPr>
         <w:spacing w:after="40" w:line="276" w:lineRule="auto"/>
         <w:rPr>
-          <w:rFonts w:asciiTheme="minorHAnsi" w:hAnsiTheme="minorHAnsi" w:cstheme="minorHAnsi"/>
-          <w:sz w:val="19"/>
-          <w:szCs w:val="19"/>
-        </w:rPr>
-      </w:pPr>
-      <w:r>
-        <w:rPr>
-          <w:rFonts w:asciiTheme="minorHAnsi" w:eastAsia="Calibri" w:hAnsiTheme="minorHAnsi" w:cstheme="minorHAnsi"/>
-          <w:b/>
-          <w:bCs/>
-          <w:color w:val="222222"/>
-          <w:sz w:val="19"/>
-          <w:szCs w:val="19"/>
-        </w:rPr>
-        <w:t>Bachelor of Technology — Electrical Engineering</w:t>
-      </w:r>
-    </w:p>
-    <w:p>
-      <w:pPr>
-        <w:spacing w:after="80" w:line="276" w:lineRule="auto"/>
-        <w:rPr>
-          <w:rFonts w:asciiTheme="minorHAnsi" w:eastAsia="Calibri" w:hAnsiTheme="minorHAnsi" w:cstheme="minorHAnsi"/>
-          <w:color w:val="222222"/>
-          <w:sz w:val="19"/>
-          <w:szCs w:val="19"/>
-        </w:rPr>
-      </w:pPr>
-      <w:r>
-        <w:rPr>
-          <w:rFonts w:asciiTheme="minorHAnsi" w:eastAsia="Calibri" w:hAnsiTheme="minorHAnsi" w:cstheme="minorHAnsi"/>
-          <w:color w:val="222222"/>
-          <w:sz w:val="19"/>
-          <w:szCs w:val="19"/>
-        </w:rPr>
-        <w:t xml:space="preserve">Noida International </w:t>
-      </w:r>
-      <w:r>
-        <w:rPr>
-          <w:rFonts w:asciiTheme="minorHAnsi" w:eastAsia="Calibri" w:hAnsiTheme="minorHAnsi" w:cstheme="minorHAnsi"/>
-          <w:color w:val="222222"/>
-          <w:sz w:val="19"/>
-          <w:szCs w:val="19"/>
-        </w:rPr>
-        <w:t>University ·</w:t>
-      </w:r>
-      <w:r>
-        <w:rPr>
-          <w:rFonts w:asciiTheme="minorHAnsi" w:eastAsia="Calibri" w:hAnsiTheme="minorHAnsi" w:cstheme="minorHAnsi"/>
-          <w:color w:val="222222"/>
-          <w:sz w:val="19"/>
-          <w:szCs w:val="19"/>
-        </w:rPr>
-        <w:t xml:space="preserve"> 2012 – 2016</w:t>
-      </w:r>
-    </w:p>
-    <w:p>
-      <w:pPr>
-        <w:spacing w:after="80" w:line="276" w:lineRule="auto"/>
-        <w:rPr>
-          <w:rFonts w:asciiTheme="minorHAnsi" w:hAnsiTheme="minorHAnsi" w:cstheme="minorHAnsi"/>
-          <w:sz w:val="19"/>
-          <w:szCs w:val="19"/>
-        </w:rPr>
-      </w:pPr>
-      <w:r>
-        <w:rPr>
-          <w:rFonts w:asciiTheme="minorHAnsi" w:hAnsiTheme="minorHAnsi" w:cstheme="minorHAnsi"/>
-          <w:b/>
-          <w:bCs/>
-          <w:sz w:val="19"/>
-          <w:szCs w:val="19"/>
-        </w:rPr>
-        <w:t>All India Senior School Certificate Examination (CBSE Class XII)</w:t>
-      </w:r>
-      <w:r>
-        <w:rPr>
-          <w:rFonts w:asciiTheme="minorHAnsi" w:hAnsiTheme="minorHAnsi" w:cstheme="minorHAnsi"/>
-          <w:sz w:val="19"/>
-          <w:szCs w:val="19"/>
-        </w:rPr>
-        <w:t xml:space="preserve"> </w:t>
-      </w:r>
-      <w:r>
-        <w:rPr>
-          <w:rFonts w:asciiTheme="minorHAnsi" w:hAnsiTheme="minorHAnsi" w:cstheme="minorHAnsi"/>
-          <w:sz w:val="19"/>
-          <w:szCs w:val="19"/>
-        </w:rPr>
-        <w:br/>
-      </w:r>
-      <w:r>
-        <w:rPr>
-          <w:rFonts w:asciiTheme="minorHAnsi" w:hAnsiTheme="minorHAnsi" w:cstheme="minorHAnsi"/>
-          <w:sz w:val="19"/>
-          <w:szCs w:val="19"/>
-        </w:rPr>
-        <w:t>Ramjas School No.4, Paharganj</w:t>
-      </w:r>
-      <w:r>
-        <w:rPr>
-          <w:rFonts w:asciiTheme="minorHAnsi" w:hAnsiTheme="minorHAnsi" w:cstheme="minorHAnsi"/>
-          <w:sz w:val="19"/>
-          <w:szCs w:val="19"/>
-        </w:rPr>
-        <w:t>,</w:t>
-      </w:r>
-      <w:r>
-        <w:rPr>
-          <w:rFonts w:asciiTheme="minorHAnsi" w:hAnsiTheme="minorHAnsi" w:cstheme="minorHAnsi"/>
-          <w:sz w:val="19"/>
-          <w:szCs w:val="19"/>
-        </w:rPr>
-        <w:t xml:space="preserve"> Delhi</w:t>
-      </w:r>
-      <w:r>
-        <w:rPr>
-          <w:rFonts w:asciiTheme="minorHAnsi" w:hAnsiTheme="minorHAnsi" w:cstheme="minorHAnsi"/>
-          <w:sz w:val="19"/>
-          <w:szCs w:val="19"/>
-        </w:rPr>
-        <w:t xml:space="preserve"> 1100</w:t>
-      </w:r>
-      <w:r>
-        <w:rPr>
-          <w:rFonts w:asciiTheme="minorHAnsi" w:hAnsiTheme="minorHAnsi" w:cstheme="minorHAnsi"/>
-          <w:sz w:val="19"/>
-          <w:szCs w:val="19"/>
-        </w:rPr>
-        <w:t>55</w:t>
-      </w:r>
-    </w:p>
-    <w:p>
-      <w:pPr>
-        <w:spacing w:after="80" w:line="276" w:lineRule="auto"/>
-        <w:rPr>
-          <w:rFonts w:asciiTheme="minorHAnsi" w:hAnsiTheme="minorHAnsi" w:cstheme="minorHAnsi"/>
-          <w:sz w:val="19"/>
-          <w:szCs w:val="19"/>
-        </w:rPr>
-      </w:pPr>
-      <w:r>
-        <w:rPr>
-          <w:rFonts w:asciiTheme="minorHAnsi" w:hAnsiTheme="minorHAnsi" w:cstheme="minorHAnsi"/>
-          <w:b/>
-          <w:bCs/>
-          <w:sz w:val="19"/>
-          <w:szCs w:val="19"/>
-        </w:rPr>
-        <w:t>All India Secondary School Examination (CBSE Class X)</w:t>
-      </w:r>
-      <w:r>
-        <w:rPr>
-          <w:rFonts w:asciiTheme="minorHAnsi" w:hAnsiTheme="minorHAnsi" w:cstheme="minorHAnsi"/>
-          <w:sz w:val="19"/>
-          <w:szCs w:val="19"/>
-        </w:rPr>
-        <w:t xml:space="preserve"> </w:t>
-      </w:r>
-      <w:r>
-        <w:rPr>
-          <w:rFonts w:asciiTheme="minorHAnsi" w:hAnsiTheme="minorHAnsi" w:cstheme="minorHAnsi"/>
-          <w:sz w:val="19"/>
-          <w:szCs w:val="19"/>
-        </w:rPr>
-        <w:br/>
-      </w:r>
-      <w:r>
-        <w:rPr>
-          <w:rFonts w:asciiTheme="minorHAnsi" w:hAnsiTheme="minorHAnsi" w:cstheme="minorHAnsi"/>
-          <w:sz w:val="19"/>
-          <w:szCs w:val="19"/>
-        </w:rPr>
-        <w:t>AG DAV Centenary Public School</w:t>
-      </w:r>
-      <w:r>
-        <w:rPr>
-          <w:rFonts w:asciiTheme="minorHAnsi" w:hAnsiTheme="minorHAnsi" w:cstheme="minorHAnsi"/>
-          <w:sz w:val="19"/>
-          <w:szCs w:val="19"/>
-        </w:rPr>
-        <w:t>, Model Town, Delhi</w:t>
-      </w:r>
-      <w:r>
-        <w:rPr>
-          <w:rFonts w:asciiTheme="minorHAnsi" w:hAnsiTheme="minorHAnsi" w:cstheme="minorHAnsi"/>
-          <w:sz w:val="19"/>
-          <w:szCs w:val="19"/>
-        </w:rPr>
-        <w:t xml:space="preserve"> </w:t>
-      </w:r>
-      <w:r>
-        <w:rPr>
-          <w:rFonts w:asciiTheme="minorHAnsi" w:hAnsiTheme="minorHAnsi" w:cstheme="minorHAnsi"/>
-          <w:sz w:val="19"/>
-          <w:szCs w:val="19"/>
-        </w:rPr>
-        <w:t>110009</w:t>
-      </w:r>
+          <w:rFonts w:asciiTheme="minorHAnsi" w:eastAsia="Calibri" w:hAnsiTheme="minorHAnsi" w:cstheme="minorHAnsi"/>
+          <w:color w:val="222222"/>
+          <w:sz w:val="19"/>
+          <w:szCs w:val="19"/>
+        </w:rPr>
+      </w:pPr>
+      <w:r>
+        <w:rPr>
+          <w:rFonts w:asciiTheme="minorHAnsi" w:eastAsia="Calibri" w:hAnsiTheme="minorHAnsi" w:cstheme="minorHAnsi"/>
+          <w:color w:val="222222"/>
+          <w:sz w:val="19"/>
+          <w:szCs w:val="19"/>
+        </w:rPr>
+        <w:t xml:space="preserve">Web Development &amp; Designing — 6-Month Industrial Training from </w:t>
+      </w:r>
+      <w:r>
+        <w:rPr>
+          <w:rFonts w:asciiTheme="minorHAnsi" w:eastAsia="Calibri" w:hAnsiTheme="minorHAnsi" w:cstheme="minorHAnsi"/>
+          <w:b/>
+          <w:bCs/>
+          <w:color w:val="222222"/>
+          <w:sz w:val="19"/>
+          <w:szCs w:val="19"/>
+        </w:rPr>
+        <w:t>Amazing Training Basket Private Ltd</w:t>
+      </w:r>
+      <w:r>
+        <w:rPr>
+          <w:rFonts w:asciiTheme="minorHAnsi" w:eastAsia="Calibri" w:hAnsiTheme="minorHAnsi" w:cstheme="minorHAnsi"/>
+          <w:color w:val="222222"/>
+          <w:sz w:val="19"/>
+          <w:szCs w:val="19"/>
+        </w:rPr>
+        <w:t>., Sector 62 Noida (2019)</w:t>
+      </w:r>
+    </w:p>
+    <w:p>
+      <w:pPr>
+        <w:spacing w:after="40" w:line="276" w:lineRule="auto"/>
+        <w:rPr>
+          <w:rFonts w:asciiTheme="minorHAnsi" w:eastAsia="Calibri" w:hAnsiTheme="minorHAnsi" w:cstheme="minorHAnsi"/>
+          <w:color w:val="222222"/>
+          <w:sz w:val="19"/>
+          <w:szCs w:val="19"/>
+        </w:rPr>
+      </w:pPr>
     </w:p>
     <w:p>
       <w:pPr>
@@ -2659,128 +2068,6 @@
           <w:sz w:val="19"/>
           <w:szCs w:val="19"/>
         </w:rPr>
-        <w:t>CERTIFICATIONS</w:t>
-      </w:r>
-    </w:p>
-    <w:p>
-      <w:pPr>
-        <w:spacing w:after="40" w:line="276" w:lineRule="auto"/>
-        <w:rPr>
-          <w:rFonts w:asciiTheme="minorHAnsi" w:eastAsia="Calibri" w:hAnsiTheme="minorHAnsi" w:cstheme="minorHAnsi"/>
-          <w:color w:val="222222"/>
-          <w:sz w:val="19"/>
-          <w:szCs w:val="19"/>
-        </w:rPr>
-      </w:pPr>
-      <w:r>
-        <w:rPr>
-          <w:rFonts w:asciiTheme="minorHAnsi" w:eastAsia="Calibri" w:hAnsiTheme="minorHAnsi" w:cstheme="minorHAnsi"/>
-          <w:color w:val="222222"/>
-          <w:sz w:val="19"/>
-          <w:szCs w:val="19"/>
-        </w:rPr>
-        <w:t>Web Development &amp; Designing — 6-Month Industrial Training</w:t>
-      </w:r>
-      <w:r>
-        <w:rPr>
-          <w:rFonts w:asciiTheme="minorHAnsi" w:eastAsia="Calibri" w:hAnsiTheme="minorHAnsi" w:cstheme="minorHAnsi"/>
-          <w:color w:val="222222"/>
-          <w:sz w:val="19"/>
-          <w:szCs w:val="19"/>
-        </w:rPr>
-        <w:t xml:space="preserve"> from</w:t>
-      </w:r>
-      <w:r>
-        <w:rPr>
-          <w:rFonts w:asciiTheme="minorHAnsi" w:eastAsia="Calibri" w:hAnsiTheme="minorHAnsi" w:cstheme="minorHAnsi"/>
-          <w:color w:val="222222"/>
-          <w:sz w:val="19"/>
-          <w:szCs w:val="19"/>
-        </w:rPr>
-        <w:t xml:space="preserve"> </w:t>
-      </w:r>
-      <w:r>
-        <w:rPr>
-          <w:rFonts w:asciiTheme="minorHAnsi" w:eastAsia="Calibri" w:hAnsiTheme="minorHAnsi" w:cstheme="minorHAnsi"/>
-          <w:b/>
-          <w:bCs/>
-          <w:color w:val="222222"/>
-          <w:sz w:val="19"/>
-          <w:szCs w:val="19"/>
-        </w:rPr>
-        <w:t>Amazing Training Basket P</w:t>
-      </w:r>
-      <w:r>
-        <w:rPr>
-          <w:rFonts w:asciiTheme="minorHAnsi" w:eastAsia="Calibri" w:hAnsiTheme="minorHAnsi" w:cstheme="minorHAnsi"/>
-          <w:b/>
-          <w:bCs/>
-          <w:color w:val="222222"/>
-          <w:sz w:val="19"/>
-          <w:szCs w:val="19"/>
-        </w:rPr>
-        <w:t>rivate</w:t>
-      </w:r>
-      <w:r>
-        <w:rPr>
-          <w:rFonts w:asciiTheme="minorHAnsi" w:eastAsia="Calibri" w:hAnsiTheme="minorHAnsi" w:cstheme="minorHAnsi"/>
-          <w:b/>
-          <w:bCs/>
-          <w:color w:val="222222"/>
-          <w:sz w:val="19"/>
-          <w:szCs w:val="19"/>
-        </w:rPr>
-        <w:t xml:space="preserve"> Ltd</w:t>
-      </w:r>
-      <w:r>
-        <w:rPr>
-          <w:rFonts w:asciiTheme="minorHAnsi" w:eastAsia="Calibri" w:hAnsiTheme="minorHAnsi" w:cstheme="minorHAnsi"/>
-          <w:color w:val="222222"/>
-          <w:sz w:val="19"/>
-          <w:szCs w:val="19"/>
-        </w:rPr>
-        <w:t>.</w:t>
-      </w:r>
-      <w:r>
-        <w:rPr>
-          <w:rFonts w:asciiTheme="minorHAnsi" w:eastAsia="Calibri" w:hAnsiTheme="minorHAnsi" w:cstheme="minorHAnsi"/>
-          <w:color w:val="222222"/>
-          <w:sz w:val="19"/>
-          <w:szCs w:val="19"/>
-        </w:rPr>
-        <w:t>, Sector 62 Noida</w:t>
-      </w:r>
-      <w:r>
-        <w:rPr>
-          <w:rFonts w:asciiTheme="minorHAnsi" w:eastAsia="Calibri" w:hAnsiTheme="minorHAnsi" w:cstheme="minorHAnsi"/>
-          <w:color w:val="222222"/>
-          <w:sz w:val="19"/>
-          <w:szCs w:val="19"/>
-        </w:rPr>
-        <w:t xml:space="preserve"> (2019)</w:t>
-      </w:r>
-    </w:p>
-    <w:p>
-      <w:pPr>
-        <w:pBdr>
-          <w:bottom w:val="single" w:sz="6" w:space="2" w:color="1F3864"/>
-        </w:pBdr>
-        <w:spacing w:before="180" w:after="80" w:line="276" w:lineRule="auto"/>
-        <w:rPr>
-          <w:rFonts w:asciiTheme="minorHAnsi" w:hAnsiTheme="minorHAnsi" w:cstheme="minorHAnsi"/>
-          <w:sz w:val="19"/>
-          <w:szCs w:val="19"/>
-        </w:rPr>
-      </w:pPr>
-      <w:r>
-        <w:rPr>
-          <w:rFonts w:asciiTheme="minorHAnsi" w:eastAsia="Calibri" w:hAnsiTheme="minorHAnsi" w:cstheme="minorHAnsi"/>
-          <w:b/>
-          <w:bCs/>
-          <w:color w:val="1F3864"/>
-          <w:sz w:val="19"/>
-          <w:szCs w:val="19"/>
-        </w:rPr>
         <w:t>PORTFOLIO</w:t>
       </w:r>
     </w:p>
@@ -2810,19 +2097,7 @@
           <w:szCs w:val="19"/>
           <w:lang w:val="en-US"/>
         </w:rPr>
-        <w:t>GitHub</w:t>
-      </w:r>
-      <w:r>
-        <w:rPr>
-          <w:rFonts w:asciiTheme="minorHAnsi" w:eastAsia="Calibri" w:hAnsiTheme="minorHAnsi" w:cstheme="minorHAnsi"/>
-          <w:b/>
-          <w:bCs/>
-          <w:color w:val="222222"/>
-          <w:sz w:val="19"/>
-          <w:szCs w:val="19"/>
-          <w:lang w:val="en-US"/>
-        </w:rPr>
-        <w:t xml:space="preserve"> Portfolio Link</w:t>
+        <w:t>GitHub Portfolio Link</w:t>
       </w:r>
     </w:p>
     <w:p>
@@ -2848,27 +2123,7 @@
             <w:szCs w:val="19"/>
             <w:lang w:val="en-US"/>
           </w:rPr>
-          <w:t>https://prashant-singh-chauhan.gi</w:t>
-        </w:r>
-        <w:r>
-          <w:rPr>
-            <w:rStyle w:val="Hyperlink"/>
-            <w:rFonts w:asciiTheme="minorHAnsi" w:eastAsia="Calibri" w:hAnsiTheme="minorHAnsi" w:cstheme="minorHAnsi"/>
-            <w:sz w:val="19"/>
-            <w:szCs w:val="19"/>
-            <w:lang w:val="en-US"/>
-          </w:rPr>
-          <w:t>t</w:t>
-        </w:r>
-        <w:r>
-          <w:rPr>
-            <w:rStyle w:val="Hyperlink"/>
-            <w:rFonts w:asciiTheme="minorHAnsi" w:eastAsia="Calibri" w:hAnsiTheme="minorHAnsi" w:cstheme="minorHAnsi"/>
-            <w:sz w:val="19"/>
-            <w:szCs w:val="19"/>
-            <w:lang w:val="en-US"/>
-          </w:rPr>
-          <w:t>hub.io/</w:t>
+          <w:t>https://prashant-singh-chauhan.github.io/</w:t>
         </w:r>
       </w:hyperlink>
     </w:p>
@@ -2893,6 +2148,8 @@
           <w:tab w:val="left" w:pos="709"/>
         </w:tabs>
         <w:spacing w:after="40" w:line="276" w:lineRule="auto"/>
+      </w:pPr>
+      <w:r>
         <w:rPr>
           <w:rFonts w:asciiTheme="minorHAnsi" w:eastAsia="Calibri" w:hAnsiTheme="minorHAnsi" w:cstheme="minorHAnsi"/>
           <w:b/>
@@ -2902,42 +2159,7 @@
           <w:szCs w:val="19"/>
           <w:lang w:val="en-US"/>
         </w:rPr>
-      </w:pPr>
-      <w:r>
-        <w:rPr>
-          <w:rFonts w:asciiTheme="minorHAnsi" w:eastAsia="Calibri" w:hAnsiTheme="minorHAnsi" w:cstheme="minorHAnsi"/>
-          <w:b/>
-          <w:bCs/>
-          <w:color w:val="222222"/>
-          <w:sz w:val="19"/>
-          <w:szCs w:val="19"/>
-          <w:lang w:val="en-US"/>
-        </w:rPr>
-        <w:t xml:space="preserve">Google Drive </w:t>
-      </w:r>
-      <w:r>
-        <w:rPr>
-          <w:rFonts w:asciiTheme="minorHAnsi" w:eastAsia="Calibri" w:hAnsiTheme="minorHAnsi" w:cstheme="minorHAnsi"/>
-          <w:b/>
-          <w:bCs/>
-          <w:color w:val="222222"/>
-          <w:sz w:val="19"/>
-          <w:szCs w:val="19"/>
-          <w:lang w:val="en-US"/>
-        </w:rPr>
-        <w:t>Portfolio</w:t>
-      </w:r>
-      <w:r>
-        <w:rPr>
-          <w:rFonts w:asciiTheme="minorHAnsi" w:eastAsia="Calibri" w:hAnsiTheme="minorHAnsi" w:cstheme="minorHAnsi"/>
-          <w:b/>
-          <w:bCs/>
-          <w:color w:val="222222"/>
-          <w:sz w:val="19"/>
-          <w:szCs w:val="19"/>
-          <w:lang w:val="en-US"/>
-        </w:rPr>
-        <w:t xml:space="preserve"> Link</w:t>
+        <w:t>Google Drive Portfolio Link</w:t>
       </w:r>
       <w:r>
         <w:rPr>
@@ -2958,29 +2180,26 @@
             <w:szCs w:val="19"/>
             <w:lang w:val="en-US"/>
           </w:rPr>
-          <w:t>https://docs.google.com/spreadsheets/d/1YKYsJkKgc90Ua3PPRr0</w:t>
-        </w:r>
-        <w:r>
-          <w:rPr>
-            <w:rStyle w:val="Hyperlink"/>
-            <w:rFonts w:asciiTheme="minorHAnsi" w:eastAsia="Calibri" w:hAnsiTheme="minorHAnsi" w:cstheme="minorHAnsi"/>
-            <w:sz w:val="19"/>
-            <w:szCs w:val="19"/>
-            <w:lang w:val="en-US"/>
-          </w:rPr>
-          <w:t>B</w:t>
-        </w:r>
-        <w:r>
-          <w:rPr>
-            <w:rStyle w:val="Hyperlink"/>
-            <w:rFonts w:asciiTheme="minorHAnsi" w:eastAsia="Calibri" w:hAnsiTheme="minorHAnsi" w:cstheme="minorHAnsi"/>
-            <w:sz w:val="19"/>
-            <w:szCs w:val="19"/>
-            <w:lang w:val="en-US"/>
-          </w:rPr>
-          <w:t>FNomiGky0_oT/edit?usp=drive_link&amp;ouid=109690335616436178228&amp;rtpof=true&amp;sd=true</w:t>
+          <w:t>https://docs.google.com/spreadsheets/d/1YKYsJkKgc90Ua3PPRr0BFNomiGky0_oT/edit?usp=drive_link&amp;ouid=109690335616436178228&amp;rtpof=true&amp;sd=true</w:t>
         </w:r>
       </w:hyperlink>
+    </w:p>
+    <w:p>
+      <w:pPr>
+        <w:tabs>
+          <w:tab w:val="left" w:pos="709"/>
+        </w:tabs>
+        <w:spacing w:after="40" w:line="276" w:lineRule="auto"/>
+        <w:rPr>
+          <w:rFonts w:asciiTheme="minorHAnsi" w:eastAsia="Calibri" w:hAnsiTheme="minorHAnsi" w:cstheme="minorHAnsi"/>
+          <w:b/>
+          <w:bCs/>
+          <w:color w:val="222222"/>
+          <w:sz w:val="19"/>
+          <w:szCs w:val="19"/>
+          <w:lang w:val="en-US"/>
+        </w:rPr>
+      </w:pPr>
     </w:p>
     <w:p>
       <w:pPr>
@@ -3032,19 +2251,7 @@
           <w:szCs w:val="19"/>
           <w:lang w:val="en-US"/>
         </w:rPr>
-        <w:t>LANGUAGE</w:t>
-      </w:r>
-      <w:r>
-        <w:rPr>
-          <w:rFonts w:asciiTheme="minorHAnsi" w:eastAsia="Calibri" w:hAnsiTheme="minorHAnsi" w:cstheme="minorHAnsi"/>
-          <w:b/>
-          <w:bCs/>
-          <w:color w:val="222222"/>
-          <w:sz w:val="19"/>
-          <w:szCs w:val="19"/>
-          <w:lang w:val="en-US"/>
-        </w:rPr>
-        <w:t>S</w:t>
+        <w:t>LANGUAGES</w:t>
       </w:r>
     </w:p>
     <w:p>
@@ -3113,19 +2320,7 @@
           <w:szCs w:val="19"/>
           <w:lang w:val="en-US"/>
         </w:rPr>
-        <w:t>REFERENCE</w:t>
-      </w:r>
-      <w:r>
-        <w:rPr>
-          <w:rFonts w:asciiTheme="minorHAnsi" w:eastAsia="Calibri" w:hAnsiTheme="minorHAnsi" w:cstheme="minorHAnsi"/>
-          <w:b/>
-          <w:bCs/>
-          <w:color w:val="222222"/>
-          <w:sz w:val="19"/>
-          <w:szCs w:val="19"/>
-          <w:lang w:val="en-US"/>
-        </w:rPr>
-        <w:t xml:space="preserve"> </w:t>
+        <w:t xml:space="preserve">REFERENCE </w:t>
       </w:r>
     </w:p>
     <w:p>
@@ -3152,37 +2347,7 @@
           <w:szCs w:val="19"/>
           <w:lang w:val="en-US"/>
         </w:rPr>
-        <w:t xml:space="preserve">Mr. Nurul Hasan </w:t>
-      </w:r>
-      <w:r>
-        <w:rPr>
-          <w:rFonts w:asciiTheme="minorHAnsi" w:eastAsia="Calibri" w:hAnsiTheme="minorHAnsi" w:cstheme="minorHAnsi"/>
-          <w:color w:val="222222"/>
-          <w:sz w:val="19"/>
-          <w:szCs w:val="19"/>
-          <w:lang w:val="en-US"/>
-        </w:rPr>
-        <w:t>| Director (N2R TECHNOLOGIES LLP)</w:t>
-      </w:r>
-      <w:r>
-        <w:rPr>
-          <w:rFonts w:asciiTheme="minorHAnsi" w:eastAsia="Calibri" w:hAnsiTheme="minorHAnsi" w:cstheme="minorHAnsi"/>
-          <w:color w:val="222222"/>
-          <w:sz w:val="19"/>
-          <w:szCs w:val="19"/>
-          <w:lang w:val="en-US"/>
-        </w:rPr>
-        <w:t xml:space="preserve"> | +91 9968584843 </w:t>
-      </w:r>
-      <w:r>
-        <w:rPr>
-          <w:rFonts w:asciiTheme="minorHAnsi" w:eastAsia="Calibri" w:hAnsiTheme="minorHAnsi" w:cstheme="minorHAnsi"/>
-          <w:color w:val="222222"/>
-          <w:sz w:val="19"/>
-          <w:szCs w:val="19"/>
-          <w:lang w:val="en-US"/>
-        </w:rPr>
-        <w:t xml:space="preserve">| </w:t>
+        <w:t xml:space="preserve">Mr. Nurul Hasan | Director (N2R TECHNOLOGIES LLP) | +91 9968584843 | </w:t>
       </w:r>
       <w:hyperlink r:id="rId8" w:history="1">
         <w:r>
@@ -3392,6 +2557,119 @@
     </w:lvl>
   </w:abstractNum>
   <w:abstractNum w:abstractNumId="1" w15:restartNumberingAfterBreak="0">
+    <w:nsid w:val="07D52788"/>
+    <w:multiLevelType w:val="hybridMultilevel"/>
+    <w:tmpl w:val="7BF4BC2C"/>
+    <w:lvl w:ilvl="0" w:tplc="7D140130">
+      <w:start w:val="1"/>
+      <w:numFmt w:val="bullet"/>
+      <w:lvlText w:val="•"/>
+      <w:lvlJc w:val="left"/>
+      <w:pPr>
+        <w:ind w:left="720" w:hanging="360"/>
+      </w:pPr>
+      <w:rPr>
+        <w:rFonts w:asciiTheme="minorHAnsi" w:hAnsiTheme="minorHAnsi" w:cstheme="minorHAnsi" w:hint="default"/>
+      </w:rPr>
+    </w:lvl>
+    <w:lvl w:ilvl="1" w:tplc="F88E21EA">
+      <w:start w:val="1"/>
+      <w:numFmt w:val="bullet"/>
+      <w:lvlText w:val="•"/>
+      <w:lvlJc w:val="left"/>
+      <w:pPr>
+        <w:ind w:left="1080" w:hanging="360"/>
+      </w:pPr>
+      <w:rPr>
+        <w:rFonts w:asciiTheme="minorHAnsi" w:hAnsiTheme="minorHAnsi" w:cstheme="minorHAnsi" w:hint="default"/>
+      </w:rPr>
+    </w:lvl>
+    <w:lvl w:ilvl="2" w:tplc="89A64AF2">
+      <w:start w:val="1"/>
+      <w:numFmt w:val="bullet"/>
+      <w:lvlText w:val="•"/>
+      <w:lvlJc w:val="left"/>
+      <w:pPr>
+        <w:ind w:left="1440" w:hanging="360"/>
+      </w:pPr>
+      <w:rPr>
+        <w:rFonts w:asciiTheme="minorHAnsi" w:hAnsiTheme="minorHAnsi" w:cstheme="minorHAnsi" w:hint="default"/>
+      </w:rPr>
+    </w:lvl>
+    <w:lvl w:ilvl="3" w:tplc="83DC02E2">
+      <w:start w:val="1"/>
+      <w:numFmt w:val="bullet"/>
+      <w:lvlText w:val="•"/>
+      <w:lvlJc w:val="left"/>
+      <w:pPr>
+        <w:ind w:left="1800" w:hanging="360"/>
+      </w:pPr>
+      <w:rPr>
+        <w:rFonts w:asciiTheme="minorHAnsi" w:hAnsiTheme="minorHAnsi" w:cstheme="minorHAnsi" w:hint="default"/>
+      </w:rPr>
+    </w:lvl>
+    <w:lvl w:ilvl="4" w:tplc="12E078C2">
+      <w:start w:val="1"/>
+      <w:numFmt w:val="bullet"/>
+      <w:lvlText w:val="•"/>
+      <w:lvlJc w:val="left"/>
+      <w:pPr>
+        <w:ind w:left="2160" w:hanging="360"/>
+      </w:pPr>
+      <w:rPr>
+        <w:rFonts w:asciiTheme="minorHAnsi" w:hAnsiTheme="minorHAnsi" w:cstheme="minorHAnsi" w:hint="default"/>
+      </w:rPr>
+    </w:lvl>
+    <w:lvl w:ilvl="5" w:tplc="3EF6DB10">
+      <w:start w:val="1"/>
+      <w:numFmt w:val="bullet"/>
+      <w:lvlText w:val="•"/>
+      <w:lvlJc w:val="left"/>
+      <w:pPr>
+        <w:ind w:left="2520" w:hanging="360"/>
+      </w:pPr>
+      <w:rPr>
+        <w:rFonts w:asciiTheme="minorHAnsi" w:hAnsiTheme="minorHAnsi" w:cstheme="minorHAnsi" w:hint="default"/>
+      </w:rPr>
+    </w:lvl>
+    <w:lvl w:ilvl="6" w:tplc="9A2E820A">
+      <w:start w:val="1"/>
+      <w:numFmt w:val="bullet"/>
+      <w:lvlText w:val="•"/>
+      <w:lvlJc w:val="left"/>
+      <w:pPr>
+        <w:ind w:left="2880" w:hanging="360"/>
+      </w:pPr>
+      <w:rPr>
+        <w:rFonts w:asciiTheme="minorHAnsi" w:hAnsiTheme="minorHAnsi" w:cstheme="minorHAnsi" w:hint="default"/>
+      </w:rPr>
+    </w:lvl>
+    <w:lvl w:ilvl="7" w:tplc="575AAB8E">
+      <w:start w:val="1"/>
+      <w:numFmt w:val="bullet"/>
+      <w:lvlText w:val="•"/>
+      <w:lvlJc w:val="left"/>
+      <w:pPr>
+        <w:ind w:left="3240" w:hanging="360"/>
+      </w:pPr>
+      <w:rPr>
+        <w:rFonts w:asciiTheme="minorHAnsi" w:hAnsiTheme="minorHAnsi" w:cstheme="minorHAnsi" w:hint="default"/>
+      </w:rPr>
+    </w:lvl>
+    <w:lvl w:ilvl="8" w:tplc="D670015E">
+      <w:start w:val="1"/>
+      <w:numFmt w:val="bullet"/>
+      <w:lvlText w:val="•"/>
+      <w:lvlJc w:val="left"/>
+      <w:pPr>
+        <w:ind w:left="3600" w:hanging="360"/>
+      </w:pPr>
+      <w:rPr>
+        <w:rFonts w:asciiTheme="minorHAnsi" w:hAnsiTheme="minorHAnsi" w:cstheme="minorHAnsi" w:hint="default"/>
+      </w:rPr>
+    </w:lvl>
+  </w:abstractNum>
+  <w:abstractNum w:abstractNumId="2" w15:restartNumberingAfterBreak="0">
     <w:nsid w:val="0B0F65C1"/>
     <w:multiLevelType w:val="hybridMultilevel"/>
     <w:tmpl w:val="691AA4CC"/>
@@ -3501,7 +2779,7 @@
       </w:rPr>
     </w:lvl>
   </w:abstractNum>
-  <w:abstractNum w:abstractNumId="2" w15:restartNumberingAfterBreak="0">
+  <w:abstractNum w:abstractNumId="3" w15:restartNumberingAfterBreak="0">
     <w:nsid w:val="0DAD6642"/>
     <w:multiLevelType w:val="hybridMultilevel"/>
     <w:tmpl w:val="9E0CBCCC"/>
@@ -3611,7 +2889,7 @@
       </w:rPr>
     </w:lvl>
   </w:abstractNum>
-  <w:abstractNum w:abstractNumId="3" w15:restartNumberingAfterBreak="0">
+  <w:abstractNum w:abstractNumId="4" w15:restartNumberingAfterBreak="0">
     <w:nsid w:val="12E227E7"/>
     <w:multiLevelType w:val="hybridMultilevel"/>
     <w:tmpl w:val="E892C5EA"/>
@@ -3721,7 +2999,7 @@
       </w:rPr>
     </w:lvl>
   </w:abstractNum>
-  <w:abstractNum w:abstractNumId="4" w15:restartNumberingAfterBreak="0">
+  <w:abstractNum w:abstractNumId="5" w15:restartNumberingAfterBreak="0">
     <w:nsid w:val="194639A1"/>
     <w:multiLevelType w:val="hybridMultilevel"/>
     <w:tmpl w:val="08AE3B1E"/>
@@ -3831,7 +3109,7 @@
       </w:rPr>
     </w:lvl>
   </w:abstractNum>
-  <w:abstractNum w:abstractNumId="5" w15:restartNumberingAfterBreak="0">
+  <w:abstractNum w:abstractNumId="6" w15:restartNumberingAfterBreak="0">
     <w:nsid w:val="1D950527"/>
     <w:multiLevelType w:val="hybridMultilevel"/>
     <w:tmpl w:val="98FA41C4"/>
@@ -3941,7 +3219,7 @@
       </w:rPr>
     </w:lvl>
   </w:abstractNum>
-  <w:abstractNum w:abstractNumId="6" w15:restartNumberingAfterBreak="0">
+  <w:abstractNum w:abstractNumId="7" w15:restartNumberingAfterBreak="0">
     <w:nsid w:val="1FDB4C78"/>
     <w:multiLevelType w:val="hybridMultilevel"/>
     <w:tmpl w:val="A45259D2"/>
@@ -4054,7 +3332,7 @@
       </w:rPr>
     </w:lvl>
   </w:abstractNum>
-  <w:abstractNum w:abstractNumId="7" w15:restartNumberingAfterBreak="0">
+  <w:abstractNum w:abstractNumId="8" w15:restartNumberingAfterBreak="0">
     <w:nsid w:val="3097587E"/>
     <w:multiLevelType w:val="hybridMultilevel"/>
     <w:tmpl w:val="AD5C1B1A"/>
@@ -4140,7 +3418,7 @@
       </w:pPr>
     </w:lvl>
   </w:abstractNum>
-  <w:abstractNum w:abstractNumId="8" w15:restartNumberingAfterBreak="0">
+  <w:abstractNum w:abstractNumId="9" w15:restartNumberingAfterBreak="0">
     <w:nsid w:val="3B4917CD"/>
     <w:multiLevelType w:val="hybridMultilevel"/>
     <w:tmpl w:val="9E08443A"/>
@@ -4250,7 +3528,7 @@
       </w:rPr>
     </w:lvl>
   </w:abstractNum>
-  <w:abstractNum w:abstractNumId="9" w15:restartNumberingAfterBreak="0">
+  <w:abstractNum w:abstractNumId="10" w15:restartNumberingAfterBreak="0">
     <w:nsid w:val="3EF04185"/>
     <w:multiLevelType w:val="hybridMultilevel"/>
     <w:tmpl w:val="97BCA582"/>
@@ -4304,7 +3582,7 @@
       <w:lvlJc w:val="left"/>
     </w:lvl>
   </w:abstractNum>
-  <w:abstractNum w:abstractNumId="10" w15:restartNumberingAfterBreak="0">
+  <w:abstractNum w:abstractNumId="11" w15:restartNumberingAfterBreak="0">
     <w:nsid w:val="4390368A"/>
     <w:multiLevelType w:val="hybridMultilevel"/>
     <w:tmpl w:val="00122F2E"/>
@@ -4414,7 +3692,7 @@
       </w:rPr>
     </w:lvl>
   </w:abstractNum>
-  <w:abstractNum w:abstractNumId="11" w15:restartNumberingAfterBreak="0">
+  <w:abstractNum w:abstractNumId="12" w15:restartNumberingAfterBreak="0">
     <w:nsid w:val="47FB3891"/>
     <w:multiLevelType w:val="hybridMultilevel"/>
     <w:tmpl w:val="9B185100"/>
@@ -4524,7 +3802,7 @@
       </w:rPr>
     </w:lvl>
   </w:abstractNum>
-  <w:abstractNum w:abstractNumId="12" w15:restartNumberingAfterBreak="0">
+  <w:abstractNum w:abstractNumId="13" w15:restartNumberingAfterBreak="0">
     <w:nsid w:val="4D283894"/>
     <w:multiLevelType w:val="hybridMultilevel"/>
     <w:tmpl w:val="C6486A12"/>
@@ -4613,7 +3891,7 @@
       </w:pPr>
     </w:lvl>
   </w:abstractNum>
-  <w:abstractNum w:abstractNumId="13" w15:restartNumberingAfterBreak="0">
+  <w:abstractNum w:abstractNumId="14" w15:restartNumberingAfterBreak="0">
     <w:nsid w:val="65941FA2"/>
     <w:multiLevelType w:val="hybridMultilevel"/>
     <w:tmpl w:val="8D3A7EF2"/>
@@ -4726,7 +4004,7 @@
       </w:rPr>
     </w:lvl>
   </w:abstractNum>
-  <w:abstractNum w:abstractNumId="14" w15:restartNumberingAfterBreak="0">
+  <w:abstractNum w:abstractNumId="15" w15:restartNumberingAfterBreak="0">
     <w:nsid w:val="6DD96EF9"/>
     <w:multiLevelType w:val="hybridMultilevel"/>
     <w:tmpl w:val="4B96240C"/>
@@ -4839,7 +4117,7 @@
       </w:rPr>
     </w:lvl>
   </w:abstractNum>
-  <w:abstractNum w:abstractNumId="15" w15:restartNumberingAfterBreak="0">
+  <w:abstractNum w:abstractNumId="16" w15:restartNumberingAfterBreak="0">
     <w:nsid w:val="6F9749D5"/>
     <w:multiLevelType w:val="hybridMultilevel"/>
     <w:tmpl w:val="47CCCC8E"/>
@@ -4952,7 +4230,7 @@
       </w:rPr>
     </w:lvl>
   </w:abstractNum>
-  <w:abstractNum w:abstractNumId="16" w15:restartNumberingAfterBreak="0">
+  <w:abstractNum w:abstractNumId="17" w15:restartNumberingAfterBreak="0">
     <w:nsid w:val="793C57E0"/>
     <w:multiLevelType w:val="hybridMultilevel"/>
     <w:tmpl w:val="E49E0B9E"/>
@@ -5063,73 +4341,67 @@
     </w:lvl>
   </w:abstractNum>
   <w:num w:numId="1" w16cid:durableId="774708611">
-    <w:abstractNumId w:val="7"/>
+    <w:abstractNumId w:val="8"/>
     <w:lvlOverride w:ilvl="0">
       <w:startOverride w:val="1"/>
     </w:lvlOverride>
   </w:num>
   <w:num w:numId="2" w16cid:durableId="2133817256">
-    <w:abstractNumId w:val="9"/>
+    <w:abstractNumId w:val="10"/>
     <w:lvlOverride w:ilvl="0">
       <w:startOverride w:val="1"/>
     </w:lvlOverride>
   </w:num>
   <w:num w:numId="3" w16cid:durableId="1048648014">
-    <w:abstractNumId w:val="15"/>
+    <w:abstractNumId w:val="16"/>
   </w:num>
   <w:num w:numId="4" w16cid:durableId="213782158">
-    <w:abstractNumId w:val="9"/>
+    <w:abstractNumId w:val="10"/>
   </w:num>
   <w:num w:numId="5" w16cid:durableId="1353148861">
-    <w:abstractNumId w:val="10"/>
+    <w:abstractNumId w:val="11"/>
   </w:num>
   <w:num w:numId="6" w16cid:durableId="1429109885">
-    <w:abstractNumId w:val="5"/>
+    <w:abstractNumId w:val="6"/>
   </w:num>
   <w:num w:numId="7" w16cid:durableId="1121339509">
-    <w:abstractNumId w:val="16"/>
+    <w:abstractNumId w:val="17"/>
   </w:num>
   <w:num w:numId="8" w16cid:durableId="428085294">
     <w:abstractNumId w:val="0"/>
-    <w:lvlOverride w:ilvl="0"/>
-    <w:lvlOverride w:ilvl="1"/>
-    <w:lvlOverride w:ilvl="2"/>
-    <w:lvlOverride w:ilvl="3"/>
-    <w:lvlOverride w:ilvl="4"/>
-    <w:lvlOverride w:ilvl="5"/>
-    <w:lvlOverride w:ilvl="6"/>
-    <w:lvlOverride w:ilvl="7"/>
-    <w:lvlOverride w:ilvl="8"/>
   </w:num>
   <w:num w:numId="9" w16cid:durableId="219905251">
+    <w:abstractNumId w:val="13"/>
+  </w:num>
+  <w:num w:numId="10" w16cid:durableId="587346335">
+    <w:abstractNumId w:val="15"/>
+  </w:num>
+  <w:num w:numId="11" w16cid:durableId="1867281991">
+    <w:abstractNumId w:val="14"/>
+  </w:num>
+  <w:num w:numId="12" w16cid:durableId="1287276530">
+    <w:abstractNumId w:val="7"/>
+  </w:num>
+  <w:num w:numId="13" w16cid:durableId="1171484379">
+    <w:abstractNumId w:val="5"/>
+  </w:num>
+  <w:num w:numId="14" w16cid:durableId="125396796">
+    <w:abstractNumId w:val="9"/>
+  </w:num>
+  <w:num w:numId="15" w16cid:durableId="692414878">
+    <w:abstractNumId w:val="3"/>
+  </w:num>
+  <w:num w:numId="16" w16cid:durableId="1569000716">
+    <w:abstractNumId w:val="2"/>
+  </w:num>
+  <w:num w:numId="17" w16cid:durableId="255403624">
+    <w:abstractNumId w:val="4"/>
+  </w:num>
+  <w:num w:numId="18" w16cid:durableId="1784417922">
     <w:abstractNumId w:val="12"/>
   </w:num>
-  <w:num w:numId="10" w16cid:durableId="587346335">
-    <w:abstractNumId w:val="14"/>
-  </w:num>
-  <w:num w:numId="11" w16cid:durableId="1867281991">
-    <w:abstractNumId w:val="13"/>
-  </w:num>
-  <w:num w:numId="12" w16cid:durableId="1287276530">
-    <w:abstractNumId w:val="6"/>
-  </w:num>
-  <w:num w:numId="13" w16cid:durableId="1171484379">
-    <w:abstractNumId w:val="4"/>
-  </w:num>
-  <w:num w:numId="14" w16cid:durableId="125396796">
-    <w:abstractNumId w:val="8"/>
-  </w:num>
-  <w:num w:numId="15" w16cid:durableId="692414878">
-    <w:abstractNumId w:val="2"/>
-  </w:num>
-  <w:num w:numId="16" w16cid:durableId="1569000716">
+  <w:num w:numId="19" w16cid:durableId="1063261749">
     <w:abstractNumId w:val="1"/>
-  </w:num>
-  <w:num w:numId="17" w16cid:durableId="255403624">
-    <w:abstractNumId w:val="3"/>
-  </w:num>
-  <w:num w:numId="18" w16cid:durableId="1784417922">
-    <w:abstractNumId w:val="11"/>
   </w:num>
 </w:numbering>
 </file>
@@ -5614,6 +4886,7 @@
   <w:style w:type="character" w:default="1" w:styleId="DefaultParagraphFont">
     <w:name w:val="Default Paragraph Font"/>
     <w:uiPriority w:val="1"/>
+    <w:semiHidden/>
     <w:unhideWhenUsed/>
   </w:style>
   <w:style w:type="table" w:default="1" w:styleId="TableNormal">

</xml_diff>